<commit_message>
Update full W40 presentation scripts: 16 topics with exact GTC, Gan, ODR, OPR, Rot LC, FD, COD and Truy thu
</commit_message>
<xml_diff>
--- a/KICH_BAN_THUYET_TRINH_MOI_NHAT.docx
+++ b/KICH_BAN_THUYET_TRINH_MOI_NHAT.docx
@@ -437,7 +437,7 @@
                 <w:color w:val="1F2937"/>
                 <w:sz w:val="22"/>
               </w:rPr>
-              <w:t>Thứ hai: Khâu vận tải KTC vẫn đang gánh 76 chuyến xe chạy non tải dưới 30% thùng, kéo tỷ lệ lấp đầy KTC đứng yên ở mức 51,0%, gây lãng phí chi phí nhiên liệu đường trục.</w:t>
+              <w:t>Thứ hai: Khâu vận tải KTC đang báo động đỏ khi tỷ lệ lấp đầy thùng xe tụt xuống chỉ còn 45,6% (giảm -2,1%p so với 47,7% tuần W39), và số chuyến xe chạy non tải dưới 30% thùng xe tăng vọt lên tới 124 chuyến (chiếm gần một phần tư tổng số 513 chuyến KTC toàn vùng), gây lãng phí rất lớn chi phí nhiên liệu đường trục.</w:t>
             </w:r>
           </w:p>
           <w:p>
@@ -563,7 +563,7 @@
                 <w:color w:val="991B1B"/>
                 <w:sz w:val="21"/>
               </w:rPr>
-              <w:t>• 76 chuyến xe KTC chạy non tải dưới 30% thùng làm xói mòn biên lợi nhuận vận hành của vùng.</w:t>
+              <w:t>• 124 chuyến xe KTC chạy non tải dưới 30% thùng (chiếm 24,2% tổng số chuyến) làm xói mòn nghiêm trọng biên lợi nhuận vận hành của vùng.</w:t>
             </w:r>
           </w:p>
           <w:p>
@@ -595,7 +595,7 @@
                 <w:color w:val="14532D"/>
                 <w:sz w:val="21"/>
               </w:rPr>
-              <w:t>• Tuần W41 tập trung 3 mũi nhọn: Truy thu dứt điểm 187,1 Tr ₫ công nợ, tối ưu gộp chuyến 76 xe KTC non tải và cứu vãn ODR tại các bưu cục vùng sâu.</w:t>
+              <w:t>• Tuần W41 tập trung 3 mũi nhọn: Truy thu dứt điểm 187,1 Tr ₫ công nợ, tối ưu gộp chuyến 124 xe KTC non tải và cứu vãn ODR tại các bưu cục vùng sâu.</w:t>
             </w:r>
           </w:p>
         </w:tc>
@@ -1202,37 +1202,37 @@
                 <w:color w:val="1F2937"/>
                 <w:sz w:val="22"/>
               </w:rPr>
-              <w:t>• Bình Thuận: 67,45% (W39: 67,49%) ➔ Duy trì vị trí số 1 toàn vùng, hiệu suất giao cực kỳ ổn định.</w:t>
-            </w:r>
-          </w:p>
-          <w:p>
-            <w:pPr>
-              <w:spacing w:before="40" w:after="80" w:line="276" w:lineRule="auto"/>
-            </w:pPr>
-            <w:r>
-              <w:rPr>
-                <w:rFonts w:ascii="Times New Roman" w:hAnsi="Times New Roman"/>
-                <w:b w:val="0"/>
-                <w:i w:val="0"/>
-                <w:color w:val="1F2937"/>
-                <w:sz w:val="22"/>
-              </w:rPr>
-              <w:t>• Khánh Hòa: 62,23% (W39: 58,82%, tăng +3,41%p) ➔ Bứt phá qua mốc 60%, đứng thứ 2 vùng.</w:t>
-            </w:r>
-          </w:p>
-          <w:p>
-            <w:pPr>
-              <w:spacing w:before="40" w:after="80" w:line="276" w:lineRule="auto"/>
-            </w:pPr>
-            <w:r>
-              <w:rPr>
-                <w:rFonts w:ascii="Times New Roman" w:hAnsi="Times New Roman"/>
-                <w:b w:val="0"/>
-                <w:i w:val="0"/>
-                <w:color w:val="1F2937"/>
-                <w:sz w:val="22"/>
-              </w:rPr>
-              <w:t>• Ninh Thuận: 60,15% (W39: 56,95%, tăng +3,20%p) ➔ Chính thức gia nhập nhóm xuất sắc &gt;60%.</w:t>
+              <w:t>• Ninh Thuận: 67,49% (W39: 67,96%) ➔ Duy trì vị trí số 1 toàn vùng, tỷ lệ giao hoàn tất cực kỳ ổn định.</w:t>
+            </w:r>
+          </w:p>
+          <w:p>
+            <w:pPr>
+              <w:spacing w:before="40" w:after="80" w:line="276" w:lineRule="auto"/>
+            </w:pPr>
+            <w:r>
+              <w:rPr>
+                <w:rFonts w:ascii="Times New Roman" w:hAnsi="Times New Roman"/>
+                <w:b w:val="0"/>
+                <w:i w:val="0"/>
+                <w:color w:val="1F2937"/>
+                <w:sz w:val="22"/>
+              </w:rPr>
+              <w:t>• Bình Thuận: 67,45% (W39: 67,49%) ➔ Bám sát vị trí dẫn đầu, giữ phong độ bền bỉ.</w:t>
+            </w:r>
+          </w:p>
+          <w:p>
+            <w:pPr>
+              <w:spacing w:before="40" w:after="80" w:line="276" w:lineRule="auto"/>
+            </w:pPr>
+            <w:r>
+              <w:rPr>
+                <w:rFonts w:ascii="Times New Roman" w:hAnsi="Times New Roman"/>
+                <w:b w:val="0"/>
+                <w:i w:val="0"/>
+                <w:color w:val="1F2937"/>
+                <w:sz w:val="22"/>
+              </w:rPr>
+              <w:t>• Khánh Hòa: 62,23% (W39: 58,82%, tăng +3,41%p) ➔ Bứt phá qua mốc 60%, đóng góp lớn vào vùng.</w:t>
             </w:r>
           </w:p>
           <w:p>
@@ -1292,52 +1292,262 @@
                 <w:color w:val="1F2937"/>
                 <w:sz w:val="22"/>
               </w:rPr>
-              <w:t>📍 2. XẾP HẠNG %GTC THEO 18 AM:</w:t>
-            </w:r>
-          </w:p>
-          <w:p>
-            <w:pPr>
-              <w:spacing w:before="40" w:after="80" w:line="276" w:lineRule="auto"/>
-            </w:pPr>
-            <w:r>
-              <w:rPr>
-                <w:rFonts w:ascii="Times New Roman" w:hAnsi="Times New Roman"/>
-                <w:b w:val="0"/>
-                <w:i w:val="0"/>
-                <w:color w:val="1F2937"/>
-                <w:sz w:val="22"/>
-              </w:rPr>
-              <w:t>• Top AM xuất sắc (&gt;65%): Nguyễn Duy Long (71,2%), Nguyễn Ngọc Khánh (66,5%), Cao Thị Thanh Thủy (65,8%), Nguyễn Thị Tuyết Thơ (65,1%).</w:t>
-            </w:r>
-          </w:p>
-          <w:p>
-            <w:pPr>
-              <w:spacing w:before="40" w:after="80" w:line="276" w:lineRule="auto"/>
-            </w:pPr>
-            <w:r>
-              <w:rPr>
-                <w:rFonts w:ascii="Times New Roman" w:hAnsi="Times New Roman"/>
-                <w:b w:val="0"/>
-                <w:i w:val="0"/>
-                <w:color w:val="1F2937"/>
-                <w:sz w:val="22"/>
-              </w:rPr>
-              <w:t>• Top AM tiến bộ tiệm cận 60%: Lê Thanh Nhựt (61,4%), Phan Đình Duy (60,9%), Thái Thị Thanh Thư (59,8%).</w:t>
-            </w:r>
-          </w:p>
-          <w:p>
-            <w:pPr>
-              <w:spacing w:before="40" w:after="80" w:line="276" w:lineRule="auto"/>
-            </w:pPr>
-            <w:r>
-              <w:rPr>
-                <w:rFonts w:ascii="Times New Roman" w:hAnsi="Times New Roman"/>
-                <w:b w:val="0"/>
-                <w:i w:val="0"/>
-                <w:color w:val="1F2937"/>
-                <w:sz w:val="22"/>
-              </w:rPr>
-              <w:t>• Nhóm AM đáy (&lt;55% cần kèm cặp gấp): Trương Quang Linh (50,2%), Lê Minh Lợi (51,4%), Trầm Hữu Tiến (53,1%), Lê Văn Trường (53,8%), Hồng Bích Nga (54,1%).</w:t>
+              <w:t>📍 2. XẾP HẠNG %GTC TUYỆT ĐỐI THEO 18 AM (TOP ĐẦU &amp; ĐÁY BẢNG):</w:t>
+            </w:r>
+          </w:p>
+          <w:p>
+            <w:pPr>
+              <w:spacing w:before="40" w:after="80" w:line="276" w:lineRule="auto"/>
+            </w:pPr>
+            <w:r>
+              <w:rPr>
+                <w:rFonts w:ascii="Times New Roman" w:hAnsi="Times New Roman"/>
+                <w:b w:val="0"/>
+                <w:i w:val="0"/>
+                <w:color w:val="1F2937"/>
+                <w:sz w:val="22"/>
+              </w:rPr>
+              <w:t>• Top AM xuất sắc (&gt;68%): Nguyễn Ngọc Khánh (74,5% - Top 1 GTC toàn vùng), Thái Thị Thanh Thư (72,0% - Top 2 GTC), Nguyễn Đỗ Minh Nghĩa (70,4%), Nguyễn Duy Long (69,0% - Đầu tàu sản lượng 42,7k đơn), Cao Thị Thanh Thủy (68,0%).</w:t>
+            </w:r>
+          </w:p>
+          <w:p>
+            <w:pPr>
+              <w:spacing w:before="40" w:after="80" w:line="276" w:lineRule="auto"/>
+            </w:pPr>
+            <w:r>
+              <w:rPr>
+                <w:rFonts w:ascii="Times New Roman" w:hAnsi="Times New Roman"/>
+                <w:b w:val="0"/>
+                <w:i w:val="0"/>
+                <w:color w:val="1F2937"/>
+                <w:sz w:val="22"/>
+              </w:rPr>
+              <w:t>• Top AM tiến bộ (60 - 68%): Nguyễn Thị Tuyết Thơ (67,6%), Nguyễn Hoàng Phi (64,6%), Lê Thanh Nhựt (60,2%).</w:t>
+            </w:r>
+          </w:p>
+          <w:p>
+            <w:pPr>
+              <w:spacing w:before="40" w:after="80" w:line="276" w:lineRule="auto"/>
+            </w:pPr>
+            <w:r>
+              <w:rPr>
+                <w:rFonts w:ascii="Times New Roman" w:hAnsi="Times New Roman"/>
+                <w:b w:val="0"/>
+                <w:i w:val="0"/>
+                <w:color w:val="1F2937"/>
+                <w:sz w:val="22"/>
+              </w:rPr>
+              <w:t>• Nhóm AM đáy (&lt;50% cần kèm cặp gấp): Lê Minh Lợi (36,5%), Phan Nguyễn Yến Nhi (38,0%), Trương Quang Linh (40,3%), Huỳnh Thúc Duân (47,1%), Lê Văn Trường (48,9%), Nguyễn Lê Nguyên Vũ (49,0%).</w:t>
+            </w:r>
+          </w:p>
+          <w:p>
+            <w:pPr>
+              <w:spacing w:before="40" w:after="80" w:line="276" w:lineRule="auto"/>
+            </w:pPr>
+            <w:r>
+              <w:rPr>
+                <w:rFonts w:ascii="Times New Roman" w:hAnsi="Times New Roman"/>
+                <w:b w:val="0"/>
+                <w:i w:val="0"/>
+                <w:color w:val="1F2937"/>
+                <w:sz w:val="22"/>
+              </w:rPr>
+              <w:t>📍 3. TOP AM CÓ ĐÓNG GÓP TĂNG TRƯỞNG %GTC LỚN NHẤT TUẦN VỪA RỒI (Δ WoW W40 vs W39):</w:t>
+            </w:r>
+          </w:p>
+          <w:p>
+            <w:pPr>
+              <w:spacing w:before="40" w:after="80" w:line="276" w:lineRule="auto"/>
+            </w:pPr>
+            <w:r>
+              <w:rPr>
+                <w:rFonts w:ascii="Times New Roman" w:hAnsi="Times New Roman"/>
+                <w:b w:val="0"/>
+                <w:i w:val="0"/>
+                <w:color w:val="1F2937"/>
+                <w:sz w:val="22"/>
+              </w:rPr>
+              <w:t>• 🥇 AM Trương Quang Linh (Đắk Nông): Tăng mạnh nhất vùng +14,49%p (từ 25,85% lên 40,34%) ➔ Bước nhảy vọt thoát khỏi đáy tuyệt đối.</w:t>
+            </w:r>
+          </w:p>
+          <w:p>
+            <w:pPr>
+              <w:spacing w:before="40" w:after="80" w:line="276" w:lineRule="auto"/>
+            </w:pPr>
+            <w:r>
+              <w:rPr>
+                <w:rFonts w:ascii="Times New Roman" w:hAnsi="Times New Roman"/>
+                <w:b w:val="0"/>
+                <w:i w:val="0"/>
+                <w:color w:val="1F2937"/>
+                <w:sz w:val="22"/>
+              </w:rPr>
+              <w:t>• 🥈 AM Lê Văn Trường (Lâm Đồng): Tăng bứt phá +11,85%p (từ 37,10% lên 48,95%) trên tải lớn 37.411 đơn ➔ Công thần chủ lực kéo toàn tỉnh Lâm Đồng tăng vọt +7,05%p!</w:t>
+            </w:r>
+          </w:p>
+          <w:p>
+            <w:pPr>
+              <w:spacing w:before="40" w:after="80" w:line="276" w:lineRule="auto"/>
+            </w:pPr>
+            <w:r>
+              <w:rPr>
+                <w:rFonts w:ascii="Times New Roman" w:hAnsi="Times New Roman"/>
+                <w:b w:val="0"/>
+                <w:i w:val="0"/>
+                <w:color w:val="1F2937"/>
+                <w:sz w:val="22"/>
+              </w:rPr>
+              <w:t>• 🥉 AM Thái Thị Thanh Thư (Khánh Hòa): Tăng thần tốc +9,63%p (từ 62,38% lên 72,02%) trên tải lớn 35.889 đơn ➔ Nhân tố số 1 kéo tỉnh Khánh Hòa bứt phá vượt mốc 60%!</w:t>
+            </w:r>
+          </w:p>
+          <w:p>
+            <w:pPr>
+              <w:spacing w:before="40" w:after="80" w:line="276" w:lineRule="auto"/>
+            </w:pPr>
+            <w:r>
+              <w:rPr>
+                <w:rFonts w:ascii="Times New Roman" w:hAnsi="Times New Roman"/>
+                <w:b w:val="0"/>
+                <w:i w:val="0"/>
+                <w:color w:val="1F2937"/>
+                <w:sz w:val="22"/>
+              </w:rPr>
+              <w:t>• 4️⃣ AM Phan Nguyễn Yến Nhi (Lâm Đồng): Tăng +8,96%p (từ 29,00% lên 37,96%).</w:t>
+            </w:r>
+          </w:p>
+          <w:p>
+            <w:pPr>
+              <w:spacing w:before="40" w:after="80" w:line="276" w:lineRule="auto"/>
+            </w:pPr>
+            <w:r>
+              <w:rPr>
+                <w:rFonts w:ascii="Times New Roman" w:hAnsi="Times New Roman"/>
+                <w:b w:val="0"/>
+                <w:i w:val="0"/>
+                <w:color w:val="1F2937"/>
+                <w:sz w:val="22"/>
+              </w:rPr>
+              <w:t>• 5️⃣ AM Nguyễn Lê Nguyên Vũ (Lâm Đồng): Tăng +7,53%p (từ 41,44% lên 48,97%).</w:t>
+            </w:r>
+          </w:p>
+          <w:p>
+            <w:pPr>
+              <w:spacing w:before="40" w:after="80" w:line="276" w:lineRule="auto"/>
+            </w:pPr>
+            <w:r>
+              <w:rPr>
+                <w:rFonts w:ascii="Times New Roman" w:hAnsi="Times New Roman"/>
+                <w:b w:val="0"/>
+                <w:i w:val="0"/>
+                <w:color w:val="1F2937"/>
+                <w:sz w:val="22"/>
+              </w:rPr>
+              <w:t>• 6️⃣ AM Lê Minh Lợi (Lâm Đồng): Tăng +5,89%p (từ 30,61% lên 36,50%).</w:t>
+            </w:r>
+          </w:p>
+          <w:p>
+            <w:pPr>
+              <w:spacing w:before="40" w:after="80" w:line="276" w:lineRule="auto"/>
+            </w:pPr>
+            <w:r>
+              <w:rPr>
+                <w:rFonts w:ascii="Times New Roman" w:hAnsi="Times New Roman"/>
+                <w:b w:val="0"/>
+                <w:i w:val="0"/>
+                <w:color w:val="1F2937"/>
+                <w:sz w:val="22"/>
+              </w:rPr>
+              <w:t>• 7️⃣ AM Hồng Bích Nga (Lâm Đồng/Đắk Nông): Tăng +3,53%p (từ 55,87% lên 59,40%).</w:t>
+            </w:r>
+          </w:p>
+          <w:p>
+            <w:pPr>
+              <w:spacing w:before="40" w:after="80" w:line="276" w:lineRule="auto"/>
+            </w:pPr>
+            <w:r>
+              <w:rPr>
+                <w:rFonts w:ascii="Times New Roman" w:hAnsi="Times New Roman"/>
+                <w:b w:val="0"/>
+                <w:i w:val="0"/>
+                <w:color w:val="1F2937"/>
+                <w:sz w:val="22"/>
+              </w:rPr>
+              <w:t>• 8️⃣ AM Trần Thị Nhung (Đắk Nông): Tăng +3,49%p (từ 55,46% lên 58,95% với 37.073 đơn).</w:t>
+            </w:r>
+          </w:p>
+          <w:p>
+            <w:pPr>
+              <w:spacing w:before="40" w:after="80" w:line="276" w:lineRule="auto"/>
+            </w:pPr>
+            <w:r>
+              <w:rPr>
+                <w:rFonts w:ascii="Times New Roman" w:hAnsi="Times New Roman"/>
+                <w:b w:val="0"/>
+                <w:i w:val="0"/>
+                <w:color w:val="1F2937"/>
+                <w:sz w:val="22"/>
+              </w:rPr>
+              <w:t>📍 4. BÓC TÁCH RIÊNG PHÂN KHÚC %GTC TIKTOK SHOP (TTS) — ĐỘNG LỰC BỨT PHÁ 63,38% (+5,84%p WoW):</w:t>
+            </w:r>
+          </w:p>
+          <w:p>
+            <w:pPr>
+              <w:spacing w:before="40" w:after="80" w:line="276" w:lineRule="auto"/>
+            </w:pPr>
+            <w:r>
+              <w:rPr>
+                <w:rFonts w:ascii="Times New Roman" w:hAnsi="Times New Roman"/>
+                <w:b w:val="0"/>
+                <w:i w:val="0"/>
+                <w:color w:val="1F2937"/>
+                <w:sz w:val="22"/>
+              </w:rPr>
+              <w:t>• Toàn vùng TTS: Đạt đỉnh 63,38% (tăng vọt +5,84%p WoW so với W39: 57,54%), cao hơn Full hàng chung 2,51%p (60,87%).</w:t>
+            </w:r>
+          </w:p>
+          <w:p>
+            <w:pPr>
+              <w:spacing w:before="40" w:after="80" w:line="276" w:lineRule="auto"/>
+            </w:pPr>
+            <w:r>
+              <w:rPr>
+                <w:rFonts w:ascii="Times New Roman" w:hAnsi="Times New Roman"/>
+                <w:b w:val="0"/>
+                <w:i w:val="0"/>
+                <w:color w:val="1F2937"/>
+                <w:sz w:val="22"/>
+              </w:rPr>
+              <w:t>• Theo 5 Tỉnh thành TTS: Lâm Đồng tăng số 1 vùng +10,36%p (từ 48,73% lên 59,09% với 24.505 đơn TTS); Đắk Nông tăng +6,32%p (từ 49,57% lên 55,88%); Khánh Hòa tăng +3,85%p (từ 59,89% lên 63,74%); Ninh Thuận (67,94%) và Bình Thuận (67,78%) tiếp tục giữ đỉnh.</w:t>
+            </w:r>
+          </w:p>
+          <w:p>
+            <w:pPr>
+              <w:spacing w:before="40" w:after="80" w:line="276" w:lineRule="auto"/>
+            </w:pPr>
+            <w:r>
+              <w:rPr>
+                <w:rFonts w:ascii="Times New Roman" w:hAnsi="Times New Roman"/>
+                <w:b w:val="0"/>
+                <w:i w:val="0"/>
+                <w:color w:val="1F2937"/>
+                <w:sz w:val="22"/>
+              </w:rPr>
+              <w:t>• Top AM tăng trưởng GTC TTS mạnh nhất (Δ WoW): 🥇 AM Nguyễn Thanh Long (+14,84%p, từ 46,1% lên 61,0%), 🥈 AM Lê Minh Lợi (+14,57%p), 🥉 AM Lê Văn Trường (+11,41%p, từ 39,9% lên 51,3%), 4️⃣ AM Nguyễn Lê Nguyên Vũ (+9,41%p, từ 41,5% lên 51,0%), 5️⃣ AM Hồng Bích Nga (+5,58%p, từ 55,1% lên 60,7%).</w:t>
+            </w:r>
+          </w:p>
+          <w:p>
+            <w:pPr>
+              <w:spacing w:before="40" w:after="80" w:line="276" w:lineRule="auto"/>
+            </w:pPr>
+            <w:r>
+              <w:rPr>
+                <w:rFonts w:ascii="Times New Roman" w:hAnsi="Times New Roman"/>
+                <w:b w:val="0"/>
+                <w:i w:val="0"/>
+                <w:color w:val="1F2937"/>
+                <w:sz w:val="22"/>
+              </w:rPr>
+              <w:t>• Top AM đạt %GTC TTS cao nhất vùng: 🥇 Nguyễn Ngọc Khánh (75,56%), 🥈 Nguyễn Đỗ Minh Nghĩa (70,77%), 🥉 Nguyễn Duy Long (69,42% — Gánh sản lượng TTS lớn nhất vùng: 18.628 đơn), 4️⃣ Cao Thị Thanh Thủy (69,30%), 5️⃣ Nguyễn Thị Tuyết Thơ (68,73%).</w:t>
             </w:r>
           </w:p>
           <w:p>
@@ -1397,142 +1607,217 @@
                 <w:color w:val="1F2937"/>
                 <w:sz w:val="22"/>
               </w:rPr>
-              <w:t>Bình Thuận vẫn giữ vững ngôi vương với GTC 67,45%, shipper Bình Thuận chạy tuyến rất đều và khách nhận hàng rất chuẩn.</w:t>
-            </w:r>
-          </w:p>
-          <w:p>
-            <w:pPr>
-              <w:spacing w:before="40" w:after="80" w:line="276" w:lineRule="auto"/>
-            </w:pPr>
-            <w:r>
-              <w:rPr>
-                <w:rFonts w:ascii="Times New Roman" w:hAnsi="Times New Roman"/>
-                <w:b w:val="0"/>
-                <w:i w:val="0"/>
-                <w:color w:val="1F2937"/>
-                <w:sz w:val="22"/>
-              </w:rPr>
-              <w:t>Khánh Hòa và Ninh Thuận tuần này đã xuất sắc vượt qua mốc 60%. Đặc biệt Khánh Hòa tăng từ 58,8% lên 62,2%, đóng góp cực lớn vào kỳ tích chung của vùng.</w:t>
-            </w:r>
-          </w:p>
-          <w:p>
-            <w:pPr>
-              <w:spacing w:before="40" w:after="80" w:line="276" w:lineRule="auto"/>
-            </w:pPr>
-            <w:r>
-              <w:rPr>
-                <w:rFonts w:ascii="Times New Roman" w:hAnsi="Times New Roman"/>
-                <w:b w:val="0"/>
-                <w:i w:val="0"/>
-                <w:color w:val="1F2937"/>
-                <w:sz w:val="22"/>
-              </w:rPr>
-              <w:t>Hai tỉnh miền núi là Đắk Nông và Lâm Đồng: Dù vẫn đứng ở 2 vị trí cuối bảng với 54,4%, nhưng tuần này anh em đã có sự nỗ lực phi thường. Lâm Đồng kéo tăng tới hơn 7,0%p, còn Đắk Nông tăng hơn 5,6%p so với tuần trước. Em xin ghi nhận sự quyết tâm của các AM Tây Nguyên!</w:t>
-            </w:r>
-          </w:p>
-          <w:p>
-            <w:pPr>
-              <w:spacing w:before="40" w:after="80" w:line="276" w:lineRule="auto"/>
-            </w:pPr>
-            <w:r>
-              <w:rPr>
-                <w:rFonts w:ascii="Times New Roman" w:hAnsi="Times New Roman"/>
-                <w:b w:val="0"/>
-                <w:i w:val="0"/>
-                <w:color w:val="1F2937"/>
-                <w:sz w:val="22"/>
-              </w:rPr>
-              <w:t>Nhìn xuống danh sách 18 AM:</w:t>
-            </w:r>
-          </w:p>
-          <w:p>
-            <w:pPr>
-              <w:spacing w:before="40" w:after="80" w:line="276" w:lineRule="auto"/>
-            </w:pPr>
-            <w:r>
-              <w:rPr>
-                <w:rFonts w:ascii="Times New Roman" w:hAnsi="Times New Roman"/>
-                <w:b w:val="0"/>
-                <w:i w:val="0"/>
-                <w:color w:val="1F2937"/>
-                <w:sz w:val="22"/>
-              </w:rPr>
-              <w:t>Anh Long Bình Thuận tiếp tục là tấm gương sáng nhất với GTC đạt tới 71,2% — vừa gánh sản lượng lớn nhất vùng vừa có tỷ lệ giao thành công cao nhất!</w:t>
-            </w:r>
-          </w:p>
-          <w:p>
-            <w:pPr>
-              <w:spacing w:before="40" w:after="80" w:line="276" w:lineRule="auto"/>
-            </w:pPr>
-            <w:r>
-              <w:rPr>
-                <w:rFonts w:ascii="Times New Roman" w:hAnsi="Times New Roman"/>
-                <w:b w:val="0"/>
-                <w:i w:val="0"/>
-                <w:color w:val="1F2937"/>
-                <w:sz w:val="22"/>
-              </w:rPr>
-              <w:t>Chị Thủy Khánh Hòa và anh Khánh Bình Thuận cũng xuất sắc đạt trên 65%.</w:t>
-            </w:r>
-          </w:p>
-          <w:p>
-            <w:pPr>
-              <w:spacing w:before="40" w:after="80" w:line="276" w:lineRule="auto"/>
-            </w:pPr>
-            <w:r>
-              <w:rPr>
-                <w:rFonts w:ascii="Times New Roman" w:hAnsi="Times New Roman"/>
-                <w:b w:val="0"/>
-                <w:i w:val="0"/>
-                <w:color w:val="1F2937"/>
-                <w:sz w:val="22"/>
-              </w:rPr>
-              <w:t>Tuy nhiên, Ban Giám Đốc lưu ý giúp em nhóm 4 AM vẫn còn nằm dưới mốc 54%:</w:t>
-            </w:r>
-          </w:p>
-          <w:p>
-            <w:pPr>
-              <w:spacing w:before="40" w:after="80" w:line="276" w:lineRule="auto"/>
-            </w:pPr>
-            <w:r>
-              <w:rPr>
-                <w:rFonts w:ascii="Times New Roman" w:hAnsi="Times New Roman"/>
-                <w:b w:val="0"/>
-                <w:i w:val="0"/>
-                <w:color w:val="1F2937"/>
-                <w:sz w:val="22"/>
-              </w:rPr>
-              <w:t>Chỗ anh Linh Đắk Nông (50,2%) và anh Lợi Lâm Đồng (51,4%): Hai địa bàn này vẫn còn tỷ lệ khách từ chối và hẹn lùi giờ quá nhiều, shipper chưa có kỹ năng thuyết phục khách nhận hàng.</w:t>
-            </w:r>
-          </w:p>
-          <w:p>
-            <w:pPr>
-              <w:spacing w:before="40" w:after="80" w:line="276" w:lineRule="auto"/>
-            </w:pPr>
-            <w:r>
-              <w:rPr>
-                <w:rFonts w:ascii="Times New Roman" w:hAnsi="Times New Roman"/>
-                <w:b w:val="0"/>
-                <w:i w:val="0"/>
-                <w:color w:val="1F2937"/>
-                <w:sz w:val="22"/>
-              </w:rPr>
-              <w:t>Anh Trường (53,8%) và anh Tiến (53,1%) ở Lâm Đồng: Dù có tiến bộ nhưng tỷ lệ đơn không phát được vẫn chiếm gần 47%, chi phí xử lý lại đơn hàng tại đây đang rất cao.</w:t>
-            </w:r>
-          </w:p>
-          <w:p>
-            <w:pPr>
-              <w:spacing w:before="40" w:after="80" w:line="276" w:lineRule="auto"/>
-            </w:pPr>
-            <w:r>
-              <w:rPr>
-                <w:rFonts w:ascii="Times New Roman" w:hAnsi="Times New Roman"/>
-                <w:b w:val="0"/>
-                <w:i w:val="0"/>
-                <w:color w:val="1F2937"/>
-                <w:sz w:val="22"/>
-              </w:rPr>
-              <w:t>Em đề nghị tuần tới, các AM nhóm dưới phải ngồi lại với từng Trưởng bưu cục để tối ưu lại ca phát chiều. Giờ em xin chuyển qua Tab 4 mổ xẻ Ca 1 và Ca 2 ạ!"</w:t>
+              <w:t>Ninh Thuận và Bình Thuận tiếp tục là 2 điểm sáng dẫn đầu vùng về độ ổn định với GTC đạt xấp xỉ 67,5%.</w:t>
+            </w:r>
+          </w:p>
+          <w:p>
+            <w:pPr>
+              <w:spacing w:before="40" w:after="80" w:line="276" w:lineRule="auto"/>
+            </w:pPr>
+            <w:r>
+              <w:rPr>
+                <w:rFonts w:ascii="Times New Roman" w:hAnsi="Times New Roman"/>
+                <w:b w:val="0"/>
+                <w:i w:val="0"/>
+                <w:color w:val="1F2937"/>
+                <w:sz w:val="22"/>
+              </w:rPr>
+              <w:t>Khánh Hòa tuần này đã xuất sắc bứt phá qua mốc 60% khi đạt 62,2% (tăng +3,4%p so với W39: 58,8%), đóng góp cực lớn vào kỳ tích chung của toàn vùng.</w:t>
+            </w:r>
+          </w:p>
+          <w:p>
+            <w:pPr>
+              <w:spacing w:before="40" w:after="80" w:line="276" w:lineRule="auto"/>
+            </w:pPr>
+            <w:r>
+              <w:rPr>
+                <w:rFonts w:ascii="Times New Roman" w:hAnsi="Times New Roman"/>
+                <w:b w:val="0"/>
+                <w:i w:val="0"/>
+                <w:color w:val="1F2937"/>
+                <w:sz w:val="22"/>
+              </w:rPr>
+              <w:t>Hai tỉnh miền núi là Đắk Nông và Lâm Đồng: Dù vẫn đứng ở 2 vị trí cuối bảng với 54,4%, nhưng tuần này anh em đã có sự nỗ lực phi thường. Lâm Đồng kéo tăng tới hơn +7,0%p, còn Đắk Nông tăng hơn +5,6%p so với tuần trước.</w:t>
+            </w:r>
+          </w:p>
+          <w:p>
+            <w:pPr>
+              <w:spacing w:before="40" w:after="80" w:line="276" w:lineRule="auto"/>
+            </w:pPr>
+            <w:r>
+              <w:rPr>
+                <w:rFonts w:ascii="Times New Roman" w:hAnsi="Times New Roman"/>
+                <w:b w:val="0"/>
+                <w:i w:val="0"/>
+                <w:color w:val="1F2937"/>
+                <w:sz w:val="22"/>
+              </w:rPr>
+              <w:t>Đặc biệt, khi mổ xẻ đóng góp của 18 AM, Ban Giám Đốc sẽ thấy một điểm mấu chốt rất đáng biểu dương:</w:t>
+            </w:r>
+          </w:p>
+          <w:p>
+            <w:pPr>
+              <w:spacing w:before="40" w:after="80" w:line="276" w:lineRule="auto"/>
+            </w:pPr>
+            <w:r>
+              <w:rPr>
+                <w:rFonts w:ascii="Times New Roman" w:hAnsi="Times New Roman"/>
+                <w:b w:val="0"/>
+                <w:i w:val="0"/>
+                <w:color w:val="1F2937"/>
+                <w:sz w:val="22"/>
+              </w:rPr>
+              <w:t>Tuần này toàn vùng tăng mạnh +4,19%p KHÔNG PHẢI nhờ nhóm ven biển (vì Bình Thuận và Ninh Thuận đã ở mức trần nên đi ngang ~67,5%), mà công lớn nhất kéo cả vùng bứt phá tuần này thuộc về 3 AM có bước nhảy vọt thần tốc:</w:t>
+            </w:r>
+          </w:p>
+          <w:p>
+            <w:pPr>
+              <w:spacing w:before="40" w:after="80" w:line="276" w:lineRule="auto"/>
+            </w:pPr>
+            <w:r>
+              <w:rPr>
+                <w:rFonts w:ascii="Times New Roman" w:hAnsi="Times New Roman"/>
+                <w:b w:val="0"/>
+                <w:i w:val="0"/>
+                <w:color w:val="1F2937"/>
+                <w:sz w:val="22"/>
+              </w:rPr>
+              <w:t>Thứ nhất là chị Thái Thị Thanh Thư ở Khánh Hòa: Tăng vọt tới gần +10%p (từ 62,4% lên 72,0%) trên khối lượng gần 36 ngàn đơn, đưa chị Thư lên thẳng vị trí Á quân GTC toàn vùng và kéo bừng sáng cả tỉnh Khánh Hòa!</w:t>
+            </w:r>
+          </w:p>
+          <w:p>
+            <w:pPr>
+              <w:spacing w:before="40" w:after="80" w:line="276" w:lineRule="auto"/>
+            </w:pPr>
+            <w:r>
+              <w:rPr>
+                <w:rFonts w:ascii="Times New Roman" w:hAnsi="Times New Roman"/>
+                <w:b w:val="0"/>
+                <w:i w:val="0"/>
+                <w:color w:val="1F2937"/>
+                <w:sz w:val="22"/>
+              </w:rPr>
+              <w:t>Thứ hai là anh Lê Văn Trường ở Lâm Đồng: Tăng phi thường +11,9%p (từ 37,1% lên 49,0%) trên khối lượng cực lớn hơn 37 ngàn đơn! Chính anh Trường là đầu tàu kéo Lâm Đồng tăng hơn 7%p tuần này!</w:t>
+            </w:r>
+          </w:p>
+          <w:p>
+            <w:pPr>
+              <w:spacing w:before="40" w:after="80" w:line="276" w:lineRule="auto"/>
+            </w:pPr>
+            <w:r>
+              <w:rPr>
+                <w:rFonts w:ascii="Times New Roman" w:hAnsi="Times New Roman"/>
+                <w:b w:val="0"/>
+                <w:i w:val="0"/>
+                <w:color w:val="1F2937"/>
+                <w:sz w:val="22"/>
+              </w:rPr>
+              <w:t>Thứ ba là anh Trương Quang Linh ở Đắk Nông: Tăng bứt phá mạnh nhất toàn vùng với +14,5%p (từ 25,8% lên 40,3%). Bên cạnh đó, anh Vũ (+7,5%p), chị Nhi (+9,0%p) và chị Nhung (+3,5%p trên 37 ngàn đơn) cũng là những nhân tố nòng cốt kéo toàn bộ khu vực Tây Nguyên thoát đáy!</w:t>
+            </w:r>
+          </w:p>
+          <w:p>
+            <w:pPr>
+              <w:spacing w:before="40" w:after="80" w:line="276" w:lineRule="auto"/>
+            </w:pPr>
+            <w:r>
+              <w:rPr>
+                <w:rFonts w:ascii="Times New Roman" w:hAnsi="Times New Roman"/>
+                <w:b w:val="0"/>
+                <w:i w:val="0"/>
+                <w:color w:val="1F2937"/>
+                <w:sz w:val="22"/>
+              </w:rPr>
+              <w:t>Đặc biệt khi nhìn sang kênh TikTok Shop (TTS):</w:t>
+            </w:r>
+          </w:p>
+          <w:p>
+            <w:pPr>
+              <w:spacing w:before="40" w:after="80" w:line="276" w:lineRule="auto"/>
+            </w:pPr>
+            <w:r>
+              <w:rPr>
+                <w:rFonts w:ascii="Times New Roman" w:hAnsi="Times New Roman"/>
+                <w:b w:val="0"/>
+                <w:i w:val="0"/>
+                <w:color w:val="1F2937"/>
+                <w:sz w:val="22"/>
+              </w:rPr>
+              <w:t>Hiệu suất giao sàn TMĐT tuần này bùng nổ vượt bậc khi đạt kỷ lục 63,38% (tăng vọt tới +5,84%p WoW), cao hơn mặt bằng chung 2,51%p!</w:t>
+            </w:r>
+          </w:p>
+          <w:p>
+            <w:pPr>
+              <w:spacing w:before="40" w:after="80" w:line="276" w:lineRule="auto"/>
+            </w:pPr>
+            <w:r>
+              <w:rPr>
+                <w:rFonts w:ascii="Times New Roman" w:hAnsi="Times New Roman"/>
+                <w:b w:val="0"/>
+                <w:i w:val="0"/>
+                <w:color w:val="1F2937"/>
+                <w:sz w:val="22"/>
+              </w:rPr>
+              <w:t>Trong đó, anh Nguyễn Thanh Long ở Cam Ranh tăng trưởng kỷ lục +14,84%p GTC TTS, anh Lê Văn Trường kéo GTC TTS Lâm Đồng tăng tới hơn +10,3%p, và anh Nguyễn Duy Long tiếp tục là 'lá chắn thép' khi gánh tới gần 19 ngàn đơn TikTok Shop mà vẫn duy trì GTC TTS chuẩn đét ở mức 69,42%!</w:t>
+            </w:r>
+          </w:p>
+          <w:p>
+            <w:pPr>
+              <w:spacing w:before="40" w:after="80" w:line="276" w:lineRule="auto"/>
+            </w:pPr>
+            <w:r>
+              <w:rPr>
+                <w:rFonts w:ascii="Times New Roman" w:hAnsi="Times New Roman"/>
+                <w:b w:val="0"/>
+                <w:i w:val="0"/>
+                <w:color w:val="1F2937"/>
+                <w:sz w:val="22"/>
+              </w:rPr>
+              <w:t>Quán quân GTC TikTok Shop tuần này thuộc về anh Nguyễn Ngọc Khánh (75,56%) và anh Nguyễn Đỗ Minh Nghĩa (70,77%).</w:t>
+            </w:r>
+          </w:p>
+          <w:p>
+            <w:pPr>
+              <w:spacing w:before="40" w:after="80" w:line="276" w:lineRule="auto"/>
+            </w:pPr>
+            <w:r>
+              <w:rPr>
+                <w:rFonts w:ascii="Times New Roman" w:hAnsi="Times New Roman"/>
+                <w:b w:val="0"/>
+                <w:i w:val="0"/>
+                <w:color w:val="1F2937"/>
+                <w:sz w:val="22"/>
+              </w:rPr>
+              <w:t>Tuy nhiên, Ban Giám Đốc lưu ý giúp em nhóm các AM vẫn còn nằm dưới mốc 50% GTC:</w:t>
+            </w:r>
+          </w:p>
+          <w:p>
+            <w:pPr>
+              <w:spacing w:before="40" w:after="80" w:line="276" w:lineRule="auto"/>
+            </w:pPr>
+            <w:r>
+              <w:rPr>
+                <w:rFonts w:ascii="Times New Roman" w:hAnsi="Times New Roman"/>
+                <w:b w:val="0"/>
+                <w:i w:val="0"/>
+                <w:color w:val="1F2937"/>
+                <w:sz w:val="22"/>
+              </w:rPr>
+              <w:t>Dù anh Lợi (+5,9%p), chị Nhi (+9,0%p) và anh Linh (+14,5%p) đã có tiến bộ vượt bậc, nhưng GTC tuyệt đối vẫn còn dưới 40%, shipper vẫn chưa linh hoạt đổi ca phát chiều tối.</w:t>
+            </w:r>
+          </w:p>
+          <w:p>
+            <w:pPr>
+              <w:spacing w:before="40" w:after="80" w:line="276" w:lineRule="auto"/>
+            </w:pPr>
+            <w:r>
+              <w:rPr>
+                <w:rFonts w:ascii="Times New Roman" w:hAnsi="Times New Roman"/>
+                <w:b w:val="0"/>
+                <w:i w:val="0"/>
+                <w:color w:val="1F2937"/>
+                <w:sz w:val="22"/>
+              </w:rPr>
+              <w:t>Em đề nghị tuần tới, các AM nhóm dưới phải duy trì đà tiến bộ này và ngồi lại với từng Trưởng bưu cục để tối ưu lại ca phát chiều. Giờ em xin chuyển qua Tab 4 mổ xẻ Ca 1 và Ca 2 ạ!"</w:t>
             </w:r>
           </w:p>
           <w:p>
@@ -1564,7 +1849,7 @@
                 <w:color w:val="1F2937"/>
                 <w:sz w:val="21"/>
               </w:rPr>
-              <w:t>• Lâm Đồng (+7,05%p) và Đắk Nông (+5,65%p) chứng minh việc tập trung đôn đốc shipper có thể tạo ra bước nhảy vọt về GTC ngay trong 1 tuần.</w:t>
+              <w:t>• Động lực tăng trưởng GTC tuần W40 (+4,19%p toàn vùng) chủ yếu đến từ sự bứt phá của AM Lê Văn Trường (+11,85%p / 37,4k đơn) và AM Thái Thị Thanh Thư (+9,63%p / 35,9k đơn).</w:t>
             </w:r>
           </w:p>
           <w:p>
@@ -1580,7 +1865,7 @@
                 <w:color w:val="1F2937"/>
                 <w:sz w:val="21"/>
               </w:rPr>
-              <w:t>• Kênh TikTok Shop đạt 63,38% GTC, cao hơn Full hàng 2,51%p, cho thấy đơn sàn TMĐT có độ hoàn tất nhanh hơn đơn hàng ngoài.</w:t>
+              <w:t>• Kênh TikTok Shop đạt đỉnh 63,38% GTC (tăng +5,84%p WoW), trong đó Lâm Đồng bứt phá +10,36%p và Đắk Nông tăng +6,32%p.</w:t>
             </w:r>
           </w:p>
           <w:p>
@@ -1612,7 +1897,7 @@
                 <w:color w:val="991B1B"/>
                 <w:sz w:val="21"/>
               </w:rPr>
-              <w:t>• 4 AM (Linh, Lợi, Tiến, Trường) vẫn chìm dưới 54% GTC, kéo tụt mặt bằng chung và làm tăng tỷ lệ hàng dồn tồn kho.</w:t>
+              <w:t>• 6 AM (Lợi, Nhi, Linh, Duân, Trường, Vũ) dù đã có cải thiện mạnh về biến động nhưng mức tuyệt đối vẫn dưới 50% GTC, cần duy trì kỷ luật đôn đốc.</w:t>
             </w:r>
           </w:p>
           <w:p>
@@ -1660,7 +1945,7 @@
                 <w:color w:val="14532D"/>
                 <w:sz w:val="21"/>
               </w:rPr>
-              <w:t>• Áp dụng quy trình kiểm soát ca 2 của Bình Thuận cho 4 AM nhóm đáy, bắt buộc gọi lại lần 2 cho 100% đơn chưa phát trước 17h30.</w:t>
+              <w:t>• Áp dụng quy trình kiểm soát ca 2 của Bình Thuận cho các AM nhóm đáy, bắt buộc gọi lại lần 2 cho 100% đơn chưa phát trước 17h30.</w:t>
             </w:r>
           </w:p>
         </w:tc>
@@ -1684,7 +1969,7 @@
           <w:color w:val="0F4C81"/>
           <w:sz w:val="26"/>
         </w:rPr>
-        <w:t>🔥 [IV. PHÂN TÍCH CHUYÊN SÂU %GTC CA 1 (HÀNG TỒN &amp; HÀNG THUẦN) (W40)]</w:t>
+        <w:t>🎯 [IV. PHÂN TÍCH CHUYÊN SÂU %GTC TIKTOK SHOP CA 1 — TARGET SLA ≥ 76.0% (TAB 4)]</w:t>
       </w:r>
     </w:p>
     <w:tbl>
@@ -1727,277 +2012,397 @@
                 <w:color w:val="EA580C"/>
                 <w:sz w:val="23"/>
               </w:rPr>
-              <w:t>🗣️ MỔ XẺ GIAO HÀNG CA 1 SÁNG: HÀNG TỒN (52.8%) VS HÀNG THUẦN (72.4%):</w:t>
-            </w:r>
-          </w:p>
-          <w:p>
-            <w:pPr>
-              <w:spacing w:before="40" w:after="80" w:line="276" w:lineRule="auto"/>
-            </w:pPr>
-            <w:r>
-              <w:rPr>
-                <w:rFonts w:ascii="Times New Roman" w:hAnsi="Times New Roman"/>
-                <w:b w:val="0"/>
-                <w:i w:val="0"/>
-                <w:color w:val="1F2937"/>
-                <w:sz w:val="22"/>
-              </w:rPr>
-              <w:t>📍 1. BẢNG HIỆU SUẤT GIAO CA 1 THEO 5 TỈNH THÀNH (W40):</w:t>
-            </w:r>
-          </w:p>
-          <w:p>
-            <w:pPr>
-              <w:spacing w:before="40" w:after="80" w:line="276" w:lineRule="auto"/>
-            </w:pPr>
-            <w:r>
-              <w:rPr>
-                <w:rFonts w:ascii="Times New Roman" w:hAnsi="Times New Roman"/>
-                <w:b w:val="0"/>
-                <w:i w:val="0"/>
-                <w:color w:val="1F2937"/>
-                <w:sz w:val="22"/>
-              </w:rPr>
-              <w:t>• Toàn vùng: GTC Ca 1 Hàng Tồn đạt 52,80% (tăng +3,8%p) | GTC Ca 1 Hàng Thuần đạt 72,40% (tăng +3,1%p; TTS đạt đỉnh 75,80%).</w:t>
-            </w:r>
-          </w:p>
-          <w:p>
-            <w:pPr>
-              <w:spacing w:before="40" w:after="80" w:line="276" w:lineRule="auto"/>
-            </w:pPr>
-            <w:r>
-              <w:rPr>
-                <w:rFonts w:ascii="Times New Roman" w:hAnsi="Times New Roman"/>
-                <w:b w:val="0"/>
-                <w:i w:val="0"/>
-                <w:color w:val="1F2937"/>
-                <w:sz w:val="22"/>
-              </w:rPr>
-              <w:t>• Bình Thuận: Hàng Tồn 58,4% | Hàng Thuần 76,2% ➔ Đạt chuẩn SLA toàn diện.</w:t>
-            </w:r>
-          </w:p>
-          <w:p>
-            <w:pPr>
-              <w:spacing w:before="40" w:after="80" w:line="276" w:lineRule="auto"/>
-            </w:pPr>
-            <w:r>
-              <w:rPr>
-                <w:rFonts w:ascii="Times New Roman" w:hAnsi="Times New Roman"/>
-                <w:b w:val="0"/>
-                <w:i w:val="0"/>
-                <w:color w:val="1F2937"/>
-                <w:sz w:val="22"/>
-              </w:rPr>
-              <w:t>• Khánh Hòa: Hàng Tồn 56,1% | Hàng Thuần 74,5% ➔ Xử lý hàng tồn đầu ngày rất sạch.</w:t>
-            </w:r>
-          </w:p>
-          <w:p>
-            <w:pPr>
-              <w:spacing w:before="40" w:after="80" w:line="276" w:lineRule="auto"/>
-            </w:pPr>
-            <w:r>
-              <w:rPr>
-                <w:rFonts w:ascii="Times New Roman" w:hAnsi="Times New Roman"/>
-                <w:b w:val="0"/>
-                <w:i w:val="0"/>
-                <w:color w:val="1F2937"/>
-                <w:sz w:val="22"/>
-              </w:rPr>
-              <w:t>• Ninh Thuận: Hàng Tồn 53,2% | Hàng Thuần 71,8%.</w:t>
-            </w:r>
-          </w:p>
-          <w:p>
-            <w:pPr>
-              <w:spacing w:before="40" w:after="80" w:line="276" w:lineRule="auto"/>
-            </w:pPr>
-            <w:r>
-              <w:rPr>
-                <w:rFonts w:ascii="Times New Roman" w:hAnsi="Times New Roman"/>
-                <w:b w:val="0"/>
-                <w:i w:val="0"/>
-                <w:color w:val="1F2937"/>
-                <w:sz w:val="22"/>
-              </w:rPr>
-              <w:t>• Đắk Nông: Hàng Tồn 49,5% | Hàng Thuần 68,9% ➔ Hàng tồn đã kéo lên sát 50%.</w:t>
-            </w:r>
-          </w:p>
-          <w:p>
-            <w:pPr>
-              <w:spacing w:before="40" w:after="80" w:line="276" w:lineRule="auto"/>
-            </w:pPr>
-            <w:r>
-              <w:rPr>
-                <w:rFonts w:ascii="Times New Roman" w:hAnsi="Times New Roman"/>
-                <w:b w:val="0"/>
-                <w:i w:val="0"/>
-                <w:color w:val="1F2937"/>
-                <w:sz w:val="22"/>
-              </w:rPr>
-              <w:t>• Lâm Đồng: Hàng Tồn 48,2% | Hàng Thuần 67,5% ➔ Nút thắt lớn nhất nằm ở đơn tồn dồn toa.</w:t>
-            </w:r>
-          </w:p>
-          <w:p>
-            <w:pPr>
-              <w:spacing w:before="40" w:after="80" w:line="276" w:lineRule="auto"/>
-            </w:pPr>
-            <w:r>
-              <w:rPr>
-                <w:rFonts w:ascii="Times New Roman" w:hAnsi="Times New Roman"/>
-                <w:b w:val="0"/>
-                <w:i w:val="0"/>
-                <w:color w:val="1F2937"/>
-                <w:sz w:val="22"/>
-              </w:rPr>
-              <w:t>📍 2. BÓC TÁCH NGUYÊN NHÂN LỆCH PHA:</w:t>
-            </w:r>
-          </w:p>
-          <w:p>
-            <w:pPr>
-              <w:spacing w:before="40" w:after="80" w:line="276" w:lineRule="auto"/>
-            </w:pPr>
-            <w:r>
-              <w:rPr>
-                <w:rFonts w:ascii="Times New Roman" w:hAnsi="Times New Roman"/>
-                <w:b w:val="0"/>
-                <w:i w:val="0"/>
-                <w:color w:val="1F2937"/>
-                <w:sz w:val="22"/>
-              </w:rPr>
-              <w:t>• Hàng Thuần Ca 1 (hàng mới về trong đêm) được shipper ưu tiên chọn giao trước nên đạt tỷ lệ thành công rất cao (72,4%, riêng TTS đạt gần 76%).</w:t>
-            </w:r>
-          </w:p>
-          <w:p>
-            <w:pPr>
-              <w:spacing w:before="40" w:after="80" w:line="276" w:lineRule="auto"/>
-            </w:pPr>
-            <w:r>
-              <w:rPr>
-                <w:rFonts w:ascii="Times New Roman" w:hAnsi="Times New Roman"/>
-                <w:b w:val="0"/>
-                <w:i w:val="0"/>
-                <w:color w:val="1F2937"/>
-                <w:sz w:val="22"/>
-              </w:rPr>
-              <w:t>• Hàng Tồn Ca 1 (hàng của ngày hôm trước trôi sang) chỉ đạt 52,8%: Shipper có tâm lý ngại cầm hàng cũ đi phát vì sợ khách đổi ý không lấy hoặc địa chỉ khó tìm.</w:t>
-            </w:r>
-          </w:p>
-          <w:p>
-            <w:pPr>
-              <w:spacing w:before="40" w:after="80" w:line="276" w:lineRule="auto"/>
-            </w:pPr>
-            <w:r>
-              <w:rPr>
-                <w:rFonts w:ascii="Times New Roman" w:hAnsi="Times New Roman"/>
-                <w:b w:val="0"/>
-                <w:i w:val="0"/>
-                <w:color w:val="1F2937"/>
-                <w:sz w:val="22"/>
-              </w:rPr>
-              <w:t>🎙️ LỜI THOẠI THUYẾT TRÌNH TỰ NHIÊN (KHI BẬT TAB 4 &amp; 5 GTC CA 1):</w:t>
-            </w:r>
-          </w:p>
-          <w:p>
-            <w:pPr>
-              <w:spacing w:before="40" w:after="80" w:line="276" w:lineRule="auto"/>
-            </w:pPr>
-            <w:r>
-              <w:rPr>
-                <w:rFonts w:ascii="Times New Roman" w:hAnsi="Times New Roman"/>
-                <w:b w:val="0"/>
-                <w:i w:val="0"/>
-                <w:color w:val="1F2937"/>
-                <w:sz w:val="22"/>
-              </w:rPr>
-              <w:t>"Dạ khi chuyển sang Tab 4 và Tab 5 mổ xẻ chi tiết ca sáng, mọi người sẽ thấy rõ điểm nghẽn thực sự của khâu Last-mile:</w:t>
-            </w:r>
-          </w:p>
-          <w:p>
-            <w:pPr>
-              <w:spacing w:before="40" w:after="80" w:line="276" w:lineRule="auto"/>
-            </w:pPr>
-            <w:r>
-              <w:rPr>
-                <w:rFonts w:ascii="Times New Roman" w:hAnsi="Times New Roman"/>
-                <w:b w:val="0"/>
-                <w:i w:val="0"/>
-                <w:color w:val="1F2937"/>
-                <w:sz w:val="22"/>
-              </w:rPr>
-              <w:t>Nhìn vào hàng thuần mới về sáng sớm, toàn vùng giao cực kỳ tốt, đạt tới 72,4%, riêng đơn TikTok Shop lên tới gần 76%, chạm đúng trần kỳ vọng của sàn.</w:t>
-            </w:r>
-          </w:p>
-          <w:p>
-            <w:pPr>
-              <w:spacing w:before="40" w:after="80" w:line="276" w:lineRule="auto"/>
-            </w:pPr>
-            <w:r>
-              <w:rPr>
-                <w:rFonts w:ascii="Times New Roman" w:hAnsi="Times New Roman"/>
-                <w:b w:val="0"/>
-                <w:i w:val="0"/>
-                <w:color w:val="1F2937"/>
-                <w:sz w:val="22"/>
-              </w:rPr>
-              <w:t>Nhưng khi nhìn sang thẻ Hàng Tồn ở Tab 4, tỷ lệ thành công lập tức tụt xuống còn 52,8%, chênh lệch nhau tới gần 20%p!</w:t>
-            </w:r>
-          </w:p>
-          <w:p>
-            <w:pPr>
-              <w:spacing w:before="40" w:after="80" w:line="276" w:lineRule="auto"/>
-            </w:pPr>
-            <w:r>
-              <w:rPr>
-                <w:rFonts w:ascii="Times New Roman" w:hAnsi="Times New Roman"/>
-                <w:b w:val="0"/>
-                <w:i w:val="0"/>
-                <w:color w:val="1F2937"/>
-                <w:sz w:val="22"/>
-              </w:rPr>
-              <w:t>Tại sao lại như vậy?</w:t>
-            </w:r>
-          </w:p>
-          <w:p>
-            <w:pPr>
-              <w:spacing w:before="40" w:after="80" w:line="276" w:lineRule="auto"/>
-            </w:pPr>
-            <w:r>
-              <w:rPr>
-                <w:rFonts w:ascii="Times New Roman" w:hAnsi="Times New Roman"/>
-                <w:b w:val="0"/>
-                <w:i w:val="0"/>
-                <w:color w:val="1F2937"/>
-                <w:sz w:val="22"/>
-              </w:rPr>
-              <w:t>Qua kiểm tra thực tế tại các kho bưu cục ở Đà Lạt và Gia Nghĩa, em thấy shipper sáng ra lấy hàng chỉ chăm chăm lựa các kiện hàng thuần mới tinh để giao cho nhanh lấy số. Còn các đơn tồn từ hôm trước dồn lại thì để dưới đáy sọt hoặc để lại góc kho, không ưu tiên phát sớm.</w:t>
-            </w:r>
-          </w:p>
-          <w:p>
-            <w:pPr>
-              <w:spacing w:before="40" w:after="80" w:line="276" w:lineRule="auto"/>
-            </w:pPr>
-            <w:r>
-              <w:rPr>
-                <w:rFonts w:ascii="Times New Roman" w:hAnsi="Times New Roman"/>
-                <w:b w:val="0"/>
-                <w:i w:val="0"/>
-                <w:color w:val="1F2937"/>
-                <w:sz w:val="22"/>
-              </w:rPr>
-              <w:t>Hàng tồn để càng lâu thì tỷ lệ khách hủy càng cao. Ở Lâm Đồng hàng tồn Ca 1 chỉ đạt 48,2% và Đắk Nông đạt 49,5%.</w:t>
-            </w:r>
-          </w:p>
-          <w:p>
-            <w:pPr>
-              <w:spacing w:before="40" w:after="80" w:line="276" w:lineRule="auto"/>
-            </w:pPr>
-            <w:r>
-              <w:rPr>
-                <w:rFonts w:ascii="Times New Roman" w:hAnsi="Times New Roman"/>
-                <w:b w:val="0"/>
-                <w:i w:val="0"/>
-                <w:color w:val="1F2937"/>
-                <w:sz w:val="22"/>
-              </w:rPr>
-              <w:t>Anh Trường, anh Tiến với anh Linh phải quán triệt lại cho bưu tá: Quy tắc bất di bất dịch của GHN là 'First In - First Out', hàng cũ tồn hôm qua phải được gán và mang đi phát ngay chuyến đầu tiên lúc 8h sáng, không được găm hàng lại bưu cục!"</w:t>
+              <w:t>🗣️ BẢNG ĐIỀU HÀNH %GTC CA 1 TIKTOK SHOP THEO 18 AM &amp; 5 TỈNH (TARGET ≥ 76.0%):</w:t>
+            </w:r>
+          </w:p>
+          <w:p>
+            <w:pPr>
+              <w:spacing w:before="40" w:after="80" w:line="276" w:lineRule="auto"/>
+            </w:pPr>
+            <w:r>
+              <w:rPr>
+                <w:rFonts w:ascii="Times New Roman" w:hAnsi="Times New Roman"/>
+                <w:b w:val="0"/>
+                <w:i w:val="0"/>
+                <w:color w:val="1F2937"/>
+                <w:sz w:val="22"/>
+              </w:rPr>
+              <w:t>📍 1. HIỆU SUẤT TOÀN VÙNG VÀ BẢNG 5 TỈNH THÀNH (W40 vs W39):</w:t>
+            </w:r>
+          </w:p>
+          <w:p>
+            <w:pPr>
+              <w:spacing w:before="40" w:after="80" w:line="276" w:lineRule="auto"/>
+            </w:pPr>
+            <w:r>
+              <w:rPr>
+                <w:rFonts w:ascii="Times New Roman" w:hAnsi="Times New Roman"/>
+                <w:b w:val="0"/>
+                <w:i w:val="0"/>
+                <w:color w:val="1F2937"/>
+                <w:sz w:val="22"/>
+              </w:rPr>
+              <w:t>• Toàn vùng TTS Ca 1: Bứt phá ngoạn mục đạt 81,34% (tăng mạnh +6,17%p WoW so với W39: 75,16%) ➔ Chính thức vượt xa Target cam kết SLA ≥ 76.0%!</w:t>
+            </w:r>
+          </w:p>
+          <w:p>
+            <w:pPr>
+              <w:spacing w:before="40" w:after="80" w:line="276" w:lineRule="auto"/>
+            </w:pPr>
+            <w:r>
+              <w:rPr>
+                <w:rFonts w:ascii="Times New Roman" w:hAnsi="Times New Roman"/>
+                <w:b w:val="0"/>
+                <w:i w:val="0"/>
+                <w:color w:val="1F2937"/>
+                <w:sz w:val="22"/>
+              </w:rPr>
+              <w:t>• Bình Thuận: 86,45% (W39: 84,64%, +1,81%p) ➔ Quán quân Ca 1 TTS toàn vùng, giữ phong độ đỉnh cao.</w:t>
+            </w:r>
+          </w:p>
+          <w:p>
+            <w:pPr>
+              <w:spacing w:before="40" w:after="80" w:line="276" w:lineRule="auto"/>
+            </w:pPr>
+            <w:r>
+              <w:rPr>
+                <w:rFonts w:ascii="Times New Roman" w:hAnsi="Times New Roman"/>
+                <w:b w:val="0"/>
+                <w:i w:val="0"/>
+                <w:color w:val="1F2937"/>
+                <w:sz w:val="22"/>
+              </w:rPr>
+              <w:t>• Ninh Thuận: 83,78% (W39: 84,75%) ➔ Á quân toàn vùng, tỷ lệ hoàn tất ca sáng rất chuẩn.</w:t>
+            </w:r>
+          </w:p>
+          <w:p>
+            <w:pPr>
+              <w:spacing w:before="40" w:after="80" w:line="276" w:lineRule="auto"/>
+            </w:pPr>
+            <w:r>
+              <w:rPr>
+                <w:rFonts w:ascii="Times New Roman" w:hAnsi="Times New Roman"/>
+                <w:b w:val="0"/>
+                <w:i w:val="0"/>
+                <w:color w:val="1F2937"/>
+                <w:sz w:val="22"/>
+              </w:rPr>
+              <w:t>• Lâm Đồng: 80,22% (W39: 66,85%, tăng bùng nổ +13,37%p!) ➔ Lần đầu tiên vượt ngưỡng chuẩn SLA 80%!</w:t>
+            </w:r>
+          </w:p>
+          <w:p>
+            <w:pPr>
+              <w:spacing w:before="40" w:after="80" w:line="276" w:lineRule="auto"/>
+            </w:pPr>
+            <w:r>
+              <w:rPr>
+                <w:rFonts w:ascii="Times New Roman" w:hAnsi="Times New Roman"/>
+                <w:b w:val="0"/>
+                <w:i w:val="0"/>
+                <w:color w:val="1F2937"/>
+                <w:sz w:val="22"/>
+              </w:rPr>
+              <w:t>• Khánh Hòa: 80,15% (W39: 75,77%, tăng +4,37%p) ➔ Chính thức gia nhập nhóm xuất sắc &gt;80%.</w:t>
+            </w:r>
+          </w:p>
+          <w:p>
+            <w:pPr>
+              <w:spacing w:before="40" w:after="80" w:line="276" w:lineRule="auto"/>
+            </w:pPr>
+            <w:r>
+              <w:rPr>
+                <w:rFonts w:ascii="Times New Roman" w:hAnsi="Times New Roman"/>
+                <w:b w:val="0"/>
+                <w:i w:val="0"/>
+                <w:color w:val="1F2937"/>
+                <w:sz w:val="22"/>
+              </w:rPr>
+              <w:t>• Đắk Nông: 72,78% (W39: 67,81%, tăng mạnh +4,97%p) ➔ Rút ngắn khoảng cách chỉ còn thiếu 3,2%p để đạt SLA.</w:t>
+            </w:r>
+          </w:p>
+          <w:p>
+            <w:pPr>
+              <w:spacing w:before="40" w:after="80" w:line="276" w:lineRule="auto"/>
+            </w:pPr>
+            <w:r>
+              <w:rPr>
+                <w:rFonts w:ascii="Times New Roman" w:hAnsi="Times New Roman"/>
+                <w:b w:val="0"/>
+                <w:i w:val="0"/>
+                <w:color w:val="1F2937"/>
+                <w:sz w:val="22"/>
+              </w:rPr>
+              <w:t>📍 2. XẾP HẠNG 18 AM THEO %GTC CA 1 TIKTOK SHOP (TARGET SLA ≥ 76.0%):</w:t>
+            </w:r>
+          </w:p>
+          <w:p>
+            <w:pPr>
+              <w:spacing w:before="40" w:after="80" w:line="276" w:lineRule="auto"/>
+            </w:pPr>
+            <w:r>
+              <w:rPr>
+                <w:rFonts w:ascii="Times New Roman" w:hAnsi="Times New Roman"/>
+                <w:b w:val="0"/>
+                <w:i w:val="0"/>
+                <w:color w:val="1F2937"/>
+                <w:sz w:val="22"/>
+              </w:rPr>
+              <w:t>• Tỷ lệ đạt chuẩn: Đã có 13/18 AM xuất sắc đạt và vượt Target SLA ≥ 76.0% (nhuộm xanh bảng điều hành).</w:t>
+            </w:r>
+          </w:p>
+          <w:p>
+            <w:pPr>
+              <w:spacing w:before="40" w:after="80" w:line="276" w:lineRule="auto"/>
+            </w:pPr>
+            <w:r>
+              <w:rPr>
+                <w:rFonts w:ascii="Times New Roman" w:hAnsi="Times New Roman"/>
+                <w:b w:val="0"/>
+                <w:i w:val="0"/>
+                <w:color w:val="1F2937"/>
+                <w:sz w:val="22"/>
+              </w:rPr>
+              <w:t>• Top 5 AM dẫn đầu %GTC Ca 1 TTS: 🥇 AM Nguyễn Ngọc Khánh (88,94%), 🥈 AM Nguyễn Đỗ Minh Nghĩa (87,02%), 🥉 AM Cao Thị Thanh Thủy (87,01%), 👑 AM Nguyễn Duy Long (85,05% — gánh hơn 10 ngàn đơn Ca 1: 10.257 đơn), 5️⃣ AM Nguyễn Thị Tuyết Thơ (83,20%).</w:t>
+            </w:r>
+          </w:p>
+          <w:p>
+            <w:pPr>
+              <w:spacing w:before="40" w:after="80" w:line="276" w:lineRule="auto"/>
+            </w:pPr>
+            <w:r>
+              <w:rPr>
+                <w:rFonts w:ascii="Times New Roman" w:hAnsi="Times New Roman"/>
+                <w:b w:val="0"/>
+                <w:i w:val="0"/>
+                <w:color w:val="1F2937"/>
+                <w:sz w:val="22"/>
+              </w:rPr>
+              <w:t>• Top AM tăng trưởng Ca 1 TTS bứt phá nhất (Δ WoW): 🚀 AM Lê Văn Trường tăng vọt +24,72%p (từ 55,56% lên 80,28%, vượt chuẩn 76%!), 🚀 AM Trương Quang Linh (+18,94%p), 🚀 AM Phan Nguyễn Yến Nhi (+16,65%p), 🚀 AM Nguyễn Thanh Long (+16,40%p, lên 82,98%).</w:t>
+            </w:r>
+          </w:p>
+          <w:p>
+            <w:pPr>
+              <w:spacing w:before="40" w:after="80" w:line="276" w:lineRule="auto"/>
+            </w:pPr>
+            <w:r>
+              <w:rPr>
+                <w:rFonts w:ascii="Times New Roman" w:hAnsi="Times New Roman"/>
+                <w:b w:val="0"/>
+                <w:i w:val="0"/>
+                <w:color w:val="1F2937"/>
+                <w:sz w:val="22"/>
+              </w:rPr>
+              <w:t>• Nhóm 5 AM chưa đạt Target SLA 76% (cần thúc đẩy gấp): Huỳnh Thúc Duân (64,52%), Nguyễn Lê Nguyên Vũ (61,43%), Phan Nguyễn Yến Nhi (58,62%), Trương Quang Linh (58,14%), Lê Minh Lợi (46,67%).</w:t>
+            </w:r>
+          </w:p>
+          <w:p>
+            <w:pPr>
+              <w:spacing w:before="40" w:after="80" w:line="276" w:lineRule="auto"/>
+            </w:pPr>
+            <w:r>
+              <w:rPr>
+                <w:rFonts w:ascii="Times New Roman" w:hAnsi="Times New Roman"/>
+                <w:b w:val="0"/>
+                <w:i w:val="0"/>
+                <w:color w:val="1F2937"/>
+                <w:sz w:val="22"/>
+              </w:rPr>
+              <w:t>🎙️ LỜI THOẠI THUYẾT TRÌNH TỰ NHIÊN (KHI BẬT TAB 4 %GTC TTS CA 1):</w:t>
+            </w:r>
+          </w:p>
+          <w:p>
+            <w:pPr>
+              <w:spacing w:before="40" w:after="80" w:line="276" w:lineRule="auto"/>
+            </w:pPr>
+            <w:r>
+              <w:rPr>
+                <w:rFonts w:ascii="Times New Roman" w:hAnsi="Times New Roman"/>
+                <w:b w:val="0"/>
+                <w:i w:val="0"/>
+                <w:color w:val="1F2937"/>
+                <w:sz w:val="22"/>
+              </w:rPr>
+              <w:t>"Dạ mời Ban Giám Đốc và các anh chị nhìn lên màn hình Tab 4: Phân tích chuyên sâu %GTC TikTok Shop Ca 1:</w:t>
+            </w:r>
+          </w:p>
+          <w:p>
+            <w:pPr>
+              <w:spacing w:before="40" w:after="80" w:line="276" w:lineRule="auto"/>
+            </w:pPr>
+            <w:r>
+              <w:rPr>
+                <w:rFonts w:ascii="Times New Roman" w:hAnsi="Times New Roman"/>
+                <w:b w:val="0"/>
+                <w:i w:val="0"/>
+                <w:color w:val="1F2937"/>
+                <w:sz w:val="22"/>
+              </w:rPr>
+              <w:t>Tuần W40 này ghi nhận một kỳ tích rất lớn của toàn vùng Nam Trung Bộ:</w:t>
+            </w:r>
+          </w:p>
+          <w:p>
+            <w:pPr>
+              <w:spacing w:before="40" w:after="80" w:line="276" w:lineRule="auto"/>
+            </w:pPr>
+            <w:r>
+              <w:rPr>
+                <w:rFonts w:ascii="Times New Roman" w:hAnsi="Times New Roman"/>
+                <w:b w:val="0"/>
+                <w:i w:val="0"/>
+                <w:color w:val="1F2937"/>
+                <w:sz w:val="22"/>
+              </w:rPr>
+              <w:t>Hiệu suất giao hàng sàn TikTok Shop chuyến sáng Ca 1 đã chính thức vượt xa cam kết SLA 76% khi bứt phá lên tới 81,34% (tăng mạnh tới +6,17%p so với mức 75,16% của tuần W39)!</w:t>
+            </w:r>
+          </w:p>
+          <w:p>
+            <w:pPr>
+              <w:spacing w:before="40" w:after="80" w:line="276" w:lineRule="auto"/>
+            </w:pPr>
+            <w:r>
+              <w:rPr>
+                <w:rFonts w:ascii="Times New Roman" w:hAnsi="Times New Roman"/>
+                <w:b w:val="0"/>
+                <w:i w:val="0"/>
+                <w:color w:val="1F2937"/>
+                <w:sz w:val="22"/>
+              </w:rPr>
+              <w:t>Nhìn vào 5 Tỉnh thành:</w:t>
+            </w:r>
+          </w:p>
+          <w:p>
+            <w:pPr>
+              <w:spacing w:before="40" w:after="80" w:line="276" w:lineRule="auto"/>
+            </w:pPr>
+            <w:r>
+              <w:rPr>
+                <w:rFonts w:ascii="Times New Roman" w:hAnsi="Times New Roman"/>
+                <w:b w:val="0"/>
+                <w:i w:val="0"/>
+                <w:color w:val="1F2937"/>
+                <w:sz w:val="22"/>
+              </w:rPr>
+              <w:t>Bình Thuận (86,5%) và Ninh Thuận (83,8%) tiếp tục giữ vững vị thế dẫn đầu. Nhưng điều đáng mừng nhất là tuần này cả Lâm Đồng (80,2%) và Khánh Hòa (80,2%) đều đã xuất sắc kéo GTC Ca 1 sàn vượt qua ngưỡng 80%!</w:t>
+            </w:r>
+          </w:p>
+          <w:p>
+            <w:pPr>
+              <w:spacing w:before="40" w:after="80" w:line="276" w:lineRule="auto"/>
+            </w:pPr>
+            <w:r>
+              <w:rPr>
+                <w:rFonts w:ascii="Times New Roman" w:hAnsi="Times New Roman"/>
+                <w:b w:val="0"/>
+                <w:i w:val="0"/>
+                <w:color w:val="1F2937"/>
+                <w:sz w:val="22"/>
+              </w:rPr>
+              <w:t>Đặc biệt, Lâm Đồng đã có bước nhảy vọt phi thường khi tăng hơn +13,3%p so với tuần trước.</w:t>
+            </w:r>
+          </w:p>
+          <w:p>
+            <w:pPr>
+              <w:spacing w:before="40" w:after="80" w:line="276" w:lineRule="auto"/>
+            </w:pPr>
+            <w:r>
+              <w:rPr>
+                <w:rFonts w:ascii="Times New Roman" w:hAnsi="Times New Roman"/>
+                <w:b w:val="0"/>
+                <w:i w:val="0"/>
+                <w:color w:val="1F2937"/>
+                <w:sz w:val="22"/>
+              </w:rPr>
+              <w:t>Nhìn vào bảng 18 AM bên dưới:</w:t>
+            </w:r>
+          </w:p>
+          <w:p>
+            <w:pPr>
+              <w:spacing w:before="40" w:after="80" w:line="276" w:lineRule="auto"/>
+            </w:pPr>
+            <w:r>
+              <w:rPr>
+                <w:rFonts w:ascii="Times New Roman" w:hAnsi="Times New Roman"/>
+                <w:b w:val="0"/>
+                <w:i w:val="0"/>
+                <w:color w:val="1F2937"/>
+                <w:sz w:val="22"/>
+              </w:rPr>
+              <w:t>Chúng ta đã có 13 trên tổng số 18 AM đạt chuẩn xanh ≥ 76%. Quán quân thuộc về anh Nguyễn Ngọc Khánh đạt 88,9%, anh Nguyễn Đỗ Minh Nghĩa đạt 87,0% và chị Cao Thị Thanh Thủy đạt 87,0%.</w:t>
+            </w:r>
+          </w:p>
+          <w:p>
+            <w:pPr>
+              <w:spacing w:before="40" w:after="80" w:line="276" w:lineRule="auto"/>
+            </w:pPr>
+            <w:r>
+              <w:rPr>
+                <w:rFonts w:ascii="Times New Roman" w:hAnsi="Times New Roman"/>
+                <w:b w:val="0"/>
+                <w:i w:val="0"/>
+                <w:color w:val="1F2937"/>
+                <w:sz w:val="22"/>
+              </w:rPr>
+              <w:t>Đặc biệt, em xin tuyên dương anh Nguyễn Duy Long: Một mình anh Long gánh khối lượng Ca 1 TTS khổng lồ với hơn 10 ngàn đơn (10.257 đơn, chiếm gần 1/4 sản lượng Ca 1 toàn vùng) nhưng vẫn đạt tỷ lệ xuất sắc lên tới 85,05%!</w:t>
+            </w:r>
+          </w:p>
+          <w:p>
+            <w:pPr>
+              <w:spacing w:before="40" w:after="80" w:line="276" w:lineRule="auto"/>
+            </w:pPr>
+            <w:r>
+              <w:rPr>
+                <w:rFonts w:ascii="Times New Roman" w:hAnsi="Times New Roman"/>
+                <w:b w:val="0"/>
+                <w:i w:val="0"/>
+                <w:color w:val="1F2937"/>
+                <w:sz w:val="22"/>
+              </w:rPr>
+              <w:t>Bên cạnh đó, anh Lê Văn Trường ở Lâm Đồng đã có cú lội ngược dòng ngoạn mục nhất khi kéo GTC Ca 1 TTS tăng gần +25%p (từ 55,6% nhảy vọt lên 80,3%), đưa địa bàn Đà Lạt từ điểm nóng cảnh báo trở thành điểm đạt chuẩn SLA!</w:t>
+            </w:r>
+          </w:p>
+          <w:p>
+            <w:pPr>
+              <w:spacing w:before="40" w:after="80" w:line="276" w:lineRule="auto"/>
+            </w:pPr>
+            <w:r>
+              <w:rPr>
+                <w:rFonts w:ascii="Times New Roman" w:hAnsi="Times New Roman"/>
+                <w:b w:val="0"/>
+                <w:i w:val="0"/>
+                <w:color w:val="1F2937"/>
+                <w:sz w:val="22"/>
+              </w:rPr>
+              <w:t>Tuy nhiên, trên biểu đồ mọi người thấy vẫn còn 5 AM hiển thị màu đỏ dưới mốc 76%:</w:t>
+            </w:r>
+          </w:p>
+          <w:p>
+            <w:pPr>
+              <w:spacing w:before="40" w:after="80" w:line="276" w:lineRule="auto"/>
+            </w:pPr>
+            <w:r>
+              <w:rPr>
+                <w:rFonts w:ascii="Times New Roman" w:hAnsi="Times New Roman"/>
+                <w:b w:val="0"/>
+                <w:i w:val="0"/>
+                <w:color w:val="1F2937"/>
+                <w:sz w:val="22"/>
+              </w:rPr>
+              <w:t>Đó là chỗ anh Duân (64,5%), anh Vũ (61,4%), chị Nhi (58,6%), anh Linh (58,1%) và anh Lợi (46,7%).</w:t>
+            </w:r>
+          </w:p>
+          <w:p>
+            <w:pPr>
+              <w:spacing w:before="40" w:after="80" w:line="276" w:lineRule="auto"/>
+            </w:pPr>
+            <w:r>
+              <w:rPr>
+                <w:rFonts w:ascii="Times New Roman" w:hAnsi="Times New Roman"/>
+                <w:b w:val="0"/>
+                <w:i w:val="0"/>
+                <w:color w:val="1F2937"/>
+                <w:sz w:val="22"/>
+              </w:rPr>
+              <w:t>Em đề nghị tuần tới, 5 AM này phải áp dụng triệt để kỷ luật xuất bến: Bắt buộc shipper đi phát chuyến 1 trước 8h30 sáng để tận dụng tối đa khung giờ vàng nhận hàng của khách TikTok Shop. Giờ em xin chuyển qua Tab 5 mổ xẻ Tỷ lệ gán vận hành ạ!"</w:t>
             </w:r>
           </w:p>
           <w:p>
@@ -2029,7 +2434,7 @@
                 <w:color w:val="1F2937"/>
                 <w:sz w:val="21"/>
               </w:rPr>
-              <w:t>• Hàng thuần ca 1 đạt 75,8% TTS chứng minh năng lực giao hàng của shipper GHN rất tốt khi khách có nhu cầu nhận ngay.</w:t>
+              <w:t>• GTC Ca 1 TikTok Shop đạt kỷ lục 81,34% (tăng +6,17%p WoW), chính thức đưa toàn vùng vượt qua cam kết SLA ≥ 76.0% với sàn TMĐT.</w:t>
             </w:r>
           </w:p>
           <w:p>
@@ -2045,7 +2450,7 @@
                 <w:color w:val="1F2937"/>
                 <w:sz w:val="21"/>
               </w:rPr>
-              <w:t>• Độ trễ 20%p giữa hàng tồn và hàng thuần khẳng định shipper đang phân biệt đối xử với các kiện hàng cũ.</w:t>
+              <w:t>• 13/18 AM đã đạt chuẩn SLA, chứng minh việc đôn đốc bưu tá xuất tuyến sớm chuyến 1 đầu ngày phát huy hiệu quả rõ rệt.</w:t>
             </w:r>
           </w:p>
           <w:p>
@@ -2077,7 +2482,7 @@
                 <w:color w:val="991B1B"/>
                 <w:sz w:val="21"/>
               </w:rPr>
-              <w:t>• Đơn tồn ca 1 dưới 50% tại Lâm Đồng và Đắk Nông đang biến hàng trăm kiện hàng thành đơn tồn aging và tăng tỷ lệ hoàn trả oan uổng.</w:t>
+              <w:t>• Vẫn còn 5 AM (Duân, Vũ, Nhi, Linh, Lợi) dưới ngưỡng 76%, trong đó AM Lê Minh Lợi mới đạt 46,67%, làm kéo tụt điểm chung của các tuyến vùng sâu.</w:t>
             </w:r>
           </w:p>
           <w:p>
@@ -2109,7 +2514,7 @@
                 <w:color w:val="14532D"/>
                 <w:sz w:val="21"/>
               </w:rPr>
-              <w:t>• Trưởng bưu cục bắt buộc phải kiểm tra sọt hàng của shipper trước khi xuất bến lúc 08h15: 100% đơn tồn hôm trước phải được xếp lên trên cùng để phát trước 10h30.</w:t>
+              <w:t>• Trưởng bưu cục tại 5 AM nhóm dưới phải kiểm soát 100% shipper xuất bến chuyến 1 trước 08h30 sáng, ưu tiên giao dứt điểm các tuyến trung tâm trước 11h00.</w:t>
             </w:r>
           </w:p>
         </w:tc>
@@ -5068,7 +5473,7 @@
           <w:color w:val="0F4C81"/>
           <w:sz w:val="26"/>
         </w:rPr>
-        <w:t>🚛 [XI. BÁO CÁO ĐIỀU HÀNH KTC, VẬN TẢI, %TLTĐ THÙNG XE (51.0%) &amp; LEADTIME KHO (W40)]</w:t>
+        <w:t>🚛 [XI. BÁO CÁO ĐIỀU HÀNH KTC, VẬN TẢI, %TLTĐ THÙNG XE (45.6%) &amp; 124 CHUYẾN NON TẢI (W40)]</w:t>
       </w:r>
     </w:p>
     <w:tbl>
@@ -5111,82 +5516,157 @@
                 <w:color w:val="EA580C"/>
                 <w:sz w:val="23"/>
               </w:rPr>
-              <w:t>🗣️ HIỆU QUẢ VẬN TẢI KTC: XỬ LÝ 76 CHUYẾN XE NON TẢI DƯỚI 30% THÙNG (TAB 12):</w:t>
-            </w:r>
-          </w:p>
-          <w:p>
-            <w:pPr>
-              <w:spacing w:before="40" w:after="80" w:line="276" w:lineRule="auto"/>
-            </w:pPr>
-            <w:r>
-              <w:rPr>
-                <w:rFonts w:ascii="Times New Roman" w:hAnsi="Times New Roman"/>
-                <w:b w:val="0"/>
-                <w:i w:val="0"/>
-                <w:color w:val="1F2937"/>
-                <w:sz w:val="22"/>
-              </w:rPr>
-              <w:t>📍 1. BẢNG CHỈ SỐ VẬN TẢI &amp; KHO KTC (W40):</w:t>
-            </w:r>
-          </w:p>
-          <w:p>
-            <w:pPr>
-              <w:spacing w:before="40" w:after="80" w:line="276" w:lineRule="auto"/>
-            </w:pPr>
-            <w:r>
-              <w:rPr>
-                <w:rFonts w:ascii="Times New Roman" w:hAnsi="Times New Roman"/>
-                <w:b w:val="0"/>
-                <w:i w:val="0"/>
-                <w:color w:val="1F2937"/>
-                <w:sz w:val="22"/>
-              </w:rPr>
-              <w:t>• Tỷ Lệ Lấp Đầy Thùng Xe KTC (%TLTĐ): Đạt 51,0% (đứng yên so với W39, cách rất xa mục tiêu tối ưu ≥ 58,0%).</w:t>
-            </w:r>
-          </w:p>
-          <w:p>
-            <w:pPr>
-              <w:spacing w:before="40" w:after="80" w:line="276" w:lineRule="auto"/>
-            </w:pPr>
-            <w:r>
-              <w:rPr>
-                <w:rFonts w:ascii="Times New Roman" w:hAnsi="Times New Roman"/>
-                <w:b w:val="0"/>
-                <w:i w:val="0"/>
-                <w:color w:val="1F2937"/>
-                <w:sz w:val="22"/>
-              </w:rPr>
-              <w:t>• Số chuyến xe chạy non tải (&lt;30% thùng xe): Ghi nhận 76 chuyến xuất bến trong tuần!</w:t>
-            </w:r>
-          </w:p>
-          <w:p>
-            <w:pPr>
-              <w:spacing w:before="40" w:after="80" w:line="276" w:lineRule="auto"/>
-            </w:pPr>
-            <w:r>
-              <w:rPr>
-                <w:rFonts w:ascii="Times New Roman" w:hAnsi="Times New Roman"/>
-                <w:b w:val="0"/>
-                <w:i w:val="0"/>
-                <w:color w:val="1F2937"/>
-                <w:sz w:val="22"/>
-              </w:rPr>
-              <w:t>• Tổng số chuyến xe KTC vận hành toàn vùng: 532 chuyến.</w:t>
-            </w:r>
-          </w:p>
-          <w:p>
-            <w:pPr>
-              <w:spacing w:before="40" w:after="80" w:line="276" w:lineRule="auto"/>
-            </w:pPr>
-            <w:r>
-              <w:rPr>
-                <w:rFonts w:ascii="Times New Roman" w:hAnsi="Times New Roman"/>
-                <w:b w:val="0"/>
-                <w:i w:val="0"/>
-                <w:color w:val="1F2937"/>
-                <w:sz w:val="22"/>
-              </w:rPr>
-              <w:t>• Leadtime xử lý tại các kho KTC trung chuyển: KTC Nha Trang đạt 1,8 giờ | KTC Phan Thiết đạt 2,1 giờ | KTC Đức Trọng đạt 3,4 giờ (chậm nhất vùng do nghẽn ca đêm).</w:t>
+              <w:t>🗣️ HIỆU QUẢ VẬN TẢI KTC: XỬ LÝ 124 CHUYẾN XE NON TẢI DƯỚI 30% THÙNG (TAB 12):</w:t>
+            </w:r>
+          </w:p>
+          <w:p>
+            <w:pPr>
+              <w:spacing w:before="40" w:after="80" w:line="276" w:lineRule="auto"/>
+            </w:pPr>
+            <w:r>
+              <w:rPr>
+                <w:rFonts w:ascii="Times New Roman" w:hAnsi="Times New Roman"/>
+                <w:b w:val="0"/>
+                <w:i w:val="0"/>
+                <w:color w:val="1F2937"/>
+                <w:sz w:val="22"/>
+              </w:rPr>
+              <w:t>📍 1. BẢNG CHỈ SỐ VẬN TẢI &amp; KHO KTC (W40 vs W39):</w:t>
+            </w:r>
+          </w:p>
+          <w:p>
+            <w:pPr>
+              <w:spacing w:before="40" w:after="80" w:line="276" w:lineRule="auto"/>
+            </w:pPr>
+            <w:r>
+              <w:rPr>
+                <w:rFonts w:ascii="Times New Roman" w:hAnsi="Times New Roman"/>
+                <w:b w:val="0"/>
+                <w:i w:val="0"/>
+                <w:color w:val="1F2937"/>
+                <w:sz w:val="22"/>
+              </w:rPr>
+              <w:t>• Tỷ Lệ Lấp Đầy Thùng Xe KTC (%TLTĐ Toàn Vùng): Đạt 45,6% (W39: 47,7%, tụt giảm -2,1%p, cách rất xa mục tiêu tối ưu ≥ 55,0%).</w:t>
+            </w:r>
+          </w:p>
+          <w:p>
+            <w:pPr>
+              <w:spacing w:before="40" w:after="80" w:line="276" w:lineRule="auto"/>
+            </w:pPr>
+            <w:r>
+              <w:rPr>
+                <w:rFonts w:ascii="Times New Roman" w:hAnsi="Times New Roman"/>
+                <w:b w:val="0"/>
+                <w:i w:val="0"/>
+                <w:color w:val="1F2937"/>
+                <w:sz w:val="22"/>
+              </w:rPr>
+              <w:t>• Số chuyến xe chạy non tải (&lt;30% thùng xe): Ghi nhận tới 124 chuyến xuất bến trong tuần (chiếm 24,2% tổng số 513 chuyến KTC), trong đó có 7 chuyến rỗng dưới 10%, 32 chuyến dưới 20% và 37 chuyến dưới 30%!</w:t>
+            </w:r>
+          </w:p>
+          <w:p>
+            <w:pPr>
+              <w:spacing w:before="40" w:after="80" w:line="276" w:lineRule="auto"/>
+            </w:pPr>
+            <w:r>
+              <w:rPr>
+                <w:rFonts w:ascii="Times New Roman" w:hAnsi="Times New Roman"/>
+                <w:b w:val="0"/>
+                <w:i w:val="0"/>
+                <w:color w:val="1F2937"/>
+                <w:sz w:val="22"/>
+              </w:rPr>
+              <w:t>• Tổng số chuyến xe KTC vận hành toàn vùng: 513 chuyến (giảm 14 chuyến so với 527 chuyến W39).</w:t>
+            </w:r>
+          </w:p>
+          <w:p>
+            <w:pPr>
+              <w:spacing w:before="40" w:after="80" w:line="276" w:lineRule="auto"/>
+            </w:pPr>
+            <w:r>
+              <w:rPr>
+                <w:rFonts w:ascii="Times New Roman" w:hAnsi="Times New Roman"/>
+                <w:b w:val="0"/>
+                <w:i w:val="0"/>
+                <w:color w:val="1F2937"/>
+                <w:sz w:val="22"/>
+              </w:rPr>
+              <w:t>• Chi tiết 5 kho KTC trọng điểm:</w:t>
+            </w:r>
+          </w:p>
+          <w:p>
+            <w:pPr>
+              <w:spacing w:before="40" w:after="80" w:line="276" w:lineRule="auto"/>
+            </w:pPr>
+            <w:r>
+              <w:rPr>
+                <w:rFonts w:ascii="Times New Roman" w:hAnsi="Times New Roman"/>
+                <w:b w:val="0"/>
+                <w:i w:val="0"/>
+                <w:color w:val="1F2937"/>
+                <w:sz w:val="22"/>
+              </w:rPr>
+              <w:t xml:space="preserve">  - KTC Khánh Hòa: 193 chuyến | TLTĐ 52,3% (-2,6%p) | 20 xe non tải &lt;30%.</w:t>
+            </w:r>
+          </w:p>
+          <w:p>
+            <w:pPr>
+              <w:spacing w:before="40" w:after="80" w:line="276" w:lineRule="auto"/>
+            </w:pPr>
+            <w:r>
+              <w:rPr>
+                <w:rFonts w:ascii="Times New Roman" w:hAnsi="Times New Roman"/>
+                <w:b w:val="0"/>
+                <w:i w:val="0"/>
+                <w:color w:val="1F2937"/>
+                <w:sz w:val="22"/>
+              </w:rPr>
+              <w:t xml:space="preserve">  - KTC Đức Trọng - Lâm Đồng: 110 chuyến | TLTĐ 40,6% (-4,5%p) | 43 xe non tải &lt;30% ➔ ĐIỂM NÓNG LÃNG PHÍ LỚN NHẤT VÙNG!</w:t>
+            </w:r>
+          </w:p>
+          <w:p>
+            <w:pPr>
+              <w:spacing w:before="40" w:after="80" w:line="276" w:lineRule="auto"/>
+            </w:pPr>
+            <w:r>
+              <w:rPr>
+                <w:rFonts w:ascii="Times New Roman" w:hAnsi="Times New Roman"/>
+                <w:b w:val="0"/>
+                <w:i w:val="0"/>
+                <w:color w:val="1F2937"/>
+                <w:sz w:val="22"/>
+              </w:rPr>
+              <w:t xml:space="preserve">  - KTC Bình Thuận: 113 chuyến | TLTĐ 47,7% (+1,1%p) | 20 xe non tải &lt;30%.</w:t>
+            </w:r>
+          </w:p>
+          <w:p>
+            <w:pPr>
+              <w:spacing w:before="40" w:after="80" w:line="276" w:lineRule="auto"/>
+            </w:pPr>
+            <w:r>
+              <w:rPr>
+                <w:rFonts w:ascii="Times New Roman" w:hAnsi="Times New Roman"/>
+                <w:b w:val="0"/>
+                <w:i w:val="0"/>
+                <w:color w:val="1F2937"/>
+                <w:sz w:val="22"/>
+              </w:rPr>
+              <w:t xml:space="preserve">  - KTC Bảo Lộc - Lâm Đồng: 55 chuyến | TLTĐ 38,2% (-1,6%p) | 19 xe non tải &lt;30%.</w:t>
+            </w:r>
+          </w:p>
+          <w:p>
+            <w:pPr>
+              <w:spacing w:before="40" w:after="80" w:line="276" w:lineRule="auto"/>
+            </w:pPr>
+            <w:r>
+              <w:rPr>
+                <w:rFonts w:ascii="Times New Roman" w:hAnsi="Times New Roman"/>
+                <w:b w:val="0"/>
+                <w:i w:val="0"/>
+                <w:color w:val="1F2937"/>
+                <w:sz w:val="22"/>
+              </w:rPr>
+              <w:t xml:space="preserve">  - KTC Đắk Nông: 42 chuyến | TLTĐ 31,3% (-1,9%p) | 22 xe non tải &lt;30% (hơn một nửa số chuyến chạy non tải).</w:t>
             </w:r>
           </w:p>
           <w:p>
@@ -5216,22 +5696,22 @@
                 <w:color w:val="1F2937"/>
                 <w:sz w:val="22"/>
               </w:rPr>
-              <w:t>• 76 chuyến xe non tải dưới 30% thùng xe đang làm lãng phí hàng trăm triệu đồng tiền dầu và khấu hao phương tiện.</w:t>
-            </w:r>
-          </w:p>
-          <w:p>
-            <w:pPr>
-              <w:spacing w:before="40" w:after="80" w:line="276" w:lineRule="auto"/>
-            </w:pPr>
-            <w:r>
-              <w:rPr>
-                <w:rFonts w:ascii="Times New Roman" w:hAnsi="Times New Roman"/>
-                <w:b w:val="0"/>
-                <w:i w:val="0"/>
-                <w:color w:val="1F2937"/>
-                <w:sz w:val="22"/>
-              </w:rPr>
-              <w:t>• Các hợp đồng xe thuê ngoài nhà xe Mạnh Cường chạy các tuyến bưu cục huyện (chi phí từ 22 đến 31 triệu/tháng/xe) cần rà soát lại hệ số sử dụng.</w:t>
+              <w:t>• 124 chuyến xe non tải dưới 30% thùng xe đang trực tiếp làm lãng phí hàng trăm triệu đồng tiền dầu và chi phí thuê xe.</w:t>
+            </w:r>
+          </w:p>
+          <w:p>
+            <w:pPr>
+              <w:spacing w:before="40" w:after="80" w:line="276" w:lineRule="auto"/>
+            </w:pPr>
+            <w:r>
+              <w:rPr>
+                <w:rFonts w:ascii="Times New Roman" w:hAnsi="Times New Roman"/>
+                <w:b w:val="0"/>
+                <w:i w:val="0"/>
+                <w:color w:val="1F2937"/>
+                <w:sz w:val="22"/>
+              </w:rPr>
+              <w:t>• Tuyến Đức Trọng - Lâm Đồng và Đắk Nông cần tái cấu trúc ngay lịch xuất bến xe tải.</w:t>
             </w:r>
           </w:p>
           <w:p>
@@ -5276,52 +5756,82 @@
                 <w:color w:val="1F2937"/>
                 <w:sz w:val="22"/>
               </w:rPr>
-              <w:t>Mọi người nhìn vào con số %TLTĐ thùng xe tuần này: Vẫn đang dậm chân tại chỗ ở mức 51,0%!</w:t>
-            </w:r>
-          </w:p>
-          <w:p>
-            <w:pPr>
-              <w:spacing w:before="40" w:after="80" w:line="276" w:lineRule="auto"/>
-            </w:pPr>
-            <w:r>
-              <w:rPr>
-                <w:rFonts w:ascii="Times New Roman" w:hAnsi="Times New Roman"/>
-                <w:b w:val="0"/>
-                <w:i w:val="0"/>
-                <w:color w:val="1F2937"/>
-                <w:sz w:val="22"/>
-              </w:rPr>
-              <w:t>Và trên hệ thống giám sát hành trình tuần qua phát hiện có tới 76 chuyến xe tải KTC lăn bánh trên đường với tỷ lệ lấp đầy thùng dưới 30%!</w:t>
-            </w:r>
-          </w:p>
-          <w:p>
-            <w:pPr>
-              <w:spacing w:before="40" w:after="80" w:line="276" w:lineRule="auto"/>
-            </w:pPr>
-            <w:r>
-              <w:rPr>
-                <w:rFonts w:ascii="Times New Roman" w:hAnsi="Times New Roman"/>
-                <w:b w:val="0"/>
-                <w:i w:val="0"/>
-                <w:color w:val="1F2937"/>
-                <w:sz w:val="22"/>
-              </w:rPr>
-              <w:t>Tức là chiếc xe thùng dài chạy từ Nha Trang vào Phan Thiết hay từ Đức Trọng về Bảo Lộc mà bên trong chỉ chở được có vài chục bao hàng, thùng xe rỗng tới hơn hai phần ba!</w:t>
-            </w:r>
-          </w:p>
-          <w:p>
-            <w:pPr>
-              <w:spacing w:before="40" w:after="80" w:line="276" w:lineRule="auto"/>
-            </w:pPr>
-            <w:r>
-              <w:rPr>
-                <w:rFonts w:ascii="Times New Roman" w:hAnsi="Times New Roman"/>
-                <w:b w:val="0"/>
-                <w:i w:val="0"/>
-                <w:color w:val="1F2937"/>
-                <w:sz w:val="22"/>
-              </w:rPr>
-              <w:t>Chúng ta đang trả nguyên tiền cước xe, tiền dầu, tiền cầu đường cho một chuyến xe rỗng.</w:t>
+              <w:t>Mọi người nhìn vào con số %TLTĐ thùng xe tuần này: Rất đáng lo ngại khi tụt từ 47,7% xuống chỉ còn 45,6%, giảm mất -2,1%p!</w:t>
+            </w:r>
+          </w:p>
+          <w:p>
+            <w:pPr>
+              <w:spacing w:before="40" w:after="80" w:line="276" w:lineRule="auto"/>
+            </w:pPr>
+            <w:r>
+              <w:rPr>
+                <w:rFonts w:ascii="Times New Roman" w:hAnsi="Times New Roman"/>
+                <w:b w:val="0"/>
+                <w:i w:val="0"/>
+                <w:color w:val="1F2937"/>
+                <w:sz w:val="22"/>
+              </w:rPr>
+              <w:t>Và trên hệ thống giám sát hành trình tuần qua phát hiện có tới 124 CHUYẾN XE TẢI KTC lăn bánh trên đường với tỷ lệ lấp đầy thùng dưới 30%!</w:t>
+            </w:r>
+          </w:p>
+          <w:p>
+            <w:pPr>
+              <w:spacing w:before="40" w:after="80" w:line="276" w:lineRule="auto"/>
+            </w:pPr>
+            <w:r>
+              <w:rPr>
+                <w:rFonts w:ascii="Times New Roman" w:hAnsi="Times New Roman"/>
+                <w:b w:val="0"/>
+                <w:i w:val="0"/>
+                <w:color w:val="1F2937"/>
+                <w:sz w:val="22"/>
+              </w:rPr>
+              <w:t>Trong tổng số 513 chuyến xe toàn vùng, thì cứ 4 chuyến xe chạy trên đường lại có 1 chuyến chạy non tải, thậm chí có 7 chuyến xe gần như rỗng không dưới 10% thùng xe!</w:t>
+            </w:r>
+          </w:p>
+          <w:p>
+            <w:pPr>
+              <w:spacing w:before="40" w:after="80" w:line="276" w:lineRule="auto"/>
+            </w:pPr>
+            <w:r>
+              <w:rPr>
+                <w:rFonts w:ascii="Times New Roman" w:hAnsi="Times New Roman"/>
+                <w:b w:val="0"/>
+                <w:i w:val="0"/>
+                <w:color w:val="1F2937"/>
+                <w:sz w:val="22"/>
+              </w:rPr>
+              <w:t>Điểm nóng nhất nằm ở đâu?</w:t>
+            </w:r>
+          </w:p>
+          <w:p>
+            <w:pPr>
+              <w:spacing w:before="40" w:after="80" w:line="276" w:lineRule="auto"/>
+            </w:pPr>
+            <w:r>
+              <w:rPr>
+                <w:rFonts w:ascii="Times New Roman" w:hAnsi="Times New Roman"/>
+                <w:b w:val="0"/>
+                <w:i w:val="0"/>
+                <w:color w:val="1F2937"/>
+                <w:sz w:val="22"/>
+              </w:rPr>
+              <w:t>Chính là KTC Đức Trọng ở Lâm Đồng: Một mình Đức Trọng gánh tới 43 chuyến xe non tải, tỷ lệ lấp đầy rơi tự do xuống 40,6%! Kế tiếp là Đắk Nông với 22 chuyến non tải, tỷ lệ lấp đầy chỉ vỏn vẹn 31,3% — tức là thùng xe rỗng tới hơn hai phần ba!</w:t>
+            </w:r>
+          </w:p>
+          <w:p>
+            <w:pPr>
+              <w:spacing w:before="40" w:after="80" w:line="276" w:lineRule="auto"/>
+            </w:pPr>
+            <w:r>
+              <w:rPr>
+                <w:rFonts w:ascii="Times New Roman" w:hAnsi="Times New Roman"/>
+                <w:b w:val="0"/>
+                <w:i w:val="0"/>
+                <w:color w:val="1F2937"/>
+                <w:sz w:val="22"/>
+              </w:rPr>
+              <w:t>Chúng ta đang trả nguyên tiền cước xe, tiền dầu, tiền cầu đường cho những chuyến xe chở gió.</w:t>
             </w:r>
           </w:p>
           <w:p>
@@ -5351,21 +5861,6 @@
                 <w:color w:val="1F2937"/>
                 <w:sz w:val="22"/>
               </w:rPr>
-              <w:t>Bên cạnh đó, thời gian Leadtime tại KTC Đức Trọng lên tới 3,4 giờ, trong khi Nha Trang chỉ mất 1,8 giờ. Hàng xe tải đổ xuống KTC Đức Trọng bị ngâm quá lâu mới được đưa lên băng chuyền.</w:t>
-            </w:r>
-          </w:p>
-          <w:p>
-            <w:pPr>
-              <w:spacing w:before="40" w:after="80" w:line="276" w:lineRule="auto"/>
-            </w:pPr>
-            <w:r>
-              <w:rPr>
-                <w:rFonts w:ascii="Times New Roman" w:hAnsi="Times New Roman"/>
-                <w:b w:val="0"/>
-                <w:i w:val="0"/>
-                <w:color w:val="1F2937"/>
-                <w:sz w:val="22"/>
-              </w:rPr>
               <w:t>Em đề xuất Ban Vận tải trong tuần W41 này:</w:t>
             </w:r>
           </w:p>
@@ -5381,7 +5876,7 @@
                 <w:color w:val="1F2937"/>
                 <w:sz w:val="22"/>
               </w:rPr>
-              <w:t>Phải rà soát ngay 76 chuyến xe non tải này: Tuyến nào sản lượng ít thì gộp 2 chuyến làm một hoặc chuyển sang dùng xe tải nhỏ 1,5 tấn. Tuyệt đối không cho xe chạy rỗng đường dài để bảo vệ chi phí vận hành của vùng!"</w:t>
+              <w:t>Phải rà soát và xử lý ngay 124 chuyến xe non tải này: Tuyến nào sản lượng ít thì gộp 2 chuyến làm một hoặc chuyển sang dùng xe tải nhỏ 1,5 tấn. Tuyệt đối không cho xe chạy rỗng đường dài để bảo vệ chi phí vận hành của vùng!"</w:t>
             </w:r>
           </w:p>
           <w:p>
@@ -5429,7 +5924,7 @@
                 <w:color w:val="1F2937"/>
                 <w:sz w:val="21"/>
               </w:rPr>
-              <w:t>• KTC Đức Trọng cần cải tổ quy trình chia chọn để rút ngắn Leadtime từ 3,4 giờ về dưới 2,0 giờ.</w:t>
+              <w:t>• KTC Đức Trọng (43 xe non tải) và Đắk Nông (31,3% TLTĐ) là hai nút thắt trọng điểm cần tối ưu hóa phương tiện.</w:t>
             </w:r>
           </w:p>
           <w:p>
@@ -5461,7 +5956,7 @@
                 <w:color w:val="991B1B"/>
                 <w:sz w:val="21"/>
               </w:rPr>
-              <w:t>• 76 chuyến xe non tải trực tiếp làm đội chi phí trên mỗi đơn hàng (Cost Per Order - CPO) của vùng Nam Trung Bộ.</w:t>
+              <w:t>• 124 chuyến xe non tải trực tiếp làm đội chi phí trên mỗi đơn hàng (Cost Per Order - CPO) của vùng Nam Trung Bộ.</w:t>
             </w:r>
           </w:p>
           <w:p>
@@ -7930,7 +8425,7 @@
                 <w:color w:val="1F2937"/>
                 <w:sz w:val="22"/>
               </w:rPr>
-              <w:t>• 8. (LDO) Di Linh: GTC 40,0% | Backlog 1.970 đơn (tồn &gt;5 ngày: 219 đơn) (AM Trầm Hữu Tiến).</w:t>
+              <w:t>• 8. (LDO) Di Linh: GTC 40,0% | Backlog 1.970 đơn (tồn &gt;5 ngày: 219 đơn) (AM Nguyễn Lê Nguyên Vũ).</w:t>
             </w:r>
           </w:p>
           <w:p>
@@ -7990,7 +8485,7 @@
                 <w:color w:val="1F2937"/>
                 <w:sz w:val="22"/>
               </w:rPr>
-              <w:t>• 12. (LDO) Đơn Dương: GTC 45,3% | Backlog 2.038 đơn | Dính truy thu 12,8 Tr ₫ (AM Lê Văn Trường).</w:t>
+              <w:t>• 12. (LDO) Đơn Dương: GTC 45,3% | Backlog 2.038 đơn | Dính truy thu 12,8 Tr ₫ (AM Phan Nguyễn Yến Nhi).</w:t>
             </w:r>
           </w:p>
           <w:p>
@@ -8035,7 +8530,7 @@
                 <w:color w:val="1F2937"/>
                 <w:sz w:val="22"/>
               </w:rPr>
-              <w:t>• 🟢 KHEN THƯỞNG: AM Phan Đình Duy (Top 1 Doanh thu), AM Nguyễn Duy Long (Đầu tàu Sản lượng &amp; Top 1 GTC 71,2%), AM Cao Thị Thanh Thủy (Top 1 ODR 97,8%), AM Lê Thanh Nhựt (Tăng trưởng toàn diện).</w:t>
+              <w:t>• 🟢 KHEN THƯỞNG: AM Phan Đình Duy (Top 1 Doanh thu), AM Nguyễn Ngọc Khánh (Quán quân GTC 74,5%), AM Nguyễn Duy Long (Đầu tàu Sản lượng vùng 42,7k đơn &amp; GTC 69,0%), AM Cao Thị Thanh Thủy (Top 1 ODR 97,8%), AM Lê Thanh Nhựt (Tăng trưởng sản lượng +1.316 đơn).</w:t>
             </w:r>
           </w:p>
           <w:p>
@@ -8215,7 +8710,7 @@
                 <w:color w:val="1F2937"/>
                 <w:sz w:val="22"/>
               </w:rPr>
-              <w:t>• Trọng tâm 4: Tối ưu chi phí vận tải: Gộp tuyến và cắt giảm 76 chuyến xe KTC non tải &lt;30% thùng để đưa %TLTĐ vượt mốc 55%.</w:t>
+              <w:t>• Trọng tâm 4: Tối ưu chi phí vận tải: Gộp tuyến và cắt giảm 124 chuyến xe KTC non tải &lt;30% thùng để đưa %TLTĐ vượt mốc 50%.</w:t>
             </w:r>
           </w:p>
           <w:p>

</xml_diff>